<commit_message>
Diario: sezioni C.9-C.12 e automazione dell'inserimento
</commit_message>
<xml_diff>
--- a/diario-tecnico-progetto (lettore-doc + skills-repo).docx
+++ b/diario-tecnico-progetto (lettore-doc + skills-repo).docx
@@ -14875,6 +14875,1219 @@
       </w:pPr>
       <w:r>
         <w:t>Da fare PRIMA di processare subfolder grandi (ENIVIPA, eGetrad, SCENIA): risolvere il problema anonimizzazione.</w:t>
+      </w:r>
+    </w:p>
+    <w:p>
+      <w:pPr>
+        <w:pStyle w:val="Titolo2"/>
+      </w:pPr>
+      <w:r>
+        <w:t>C.9 Anonimizzazione robusta e primo ciclo infrastrutturale (2026-07-14)</w:t>
+      </w:r>
+    </w:p>
+    <w:p>
+      <w:pPr/>
+      <w:r>
+        <w:t xml:space="preserve">Il secondo ciclo di ingest ha preso la subfolder </w:t>
+      </w:r>
+      <w:r>
+        <w:rPr>
+          <w:rFonts w:ascii="Consolas" w:hAnsi="Consolas"/>
+        </w:rPr>
+        <w:t>ARCHITETTURA SERVER-CLOUD-LINEE</w:t>
+      </w:r>
+      <w:r>
+        <w:t xml:space="preserve">, venti file testuali, ed è servito soprattutto a scoprire che la catena di anonimizzazione costruita fino a quel momento non reggeva un corpus davvero infrastrutturale. Il dry-run iniziale sul grafo grezzo ha mostrato </w:t>
+      </w:r>
+      <w:r>
+        <w:rPr>
+          <w:i/>
+        </w:rPr>
+        <w:t>leak</w:t>
+      </w:r>
+      <w:r>
+        <w:t xml:space="preserve"> sistematici: indirizzi IP interni, hostname, email aziendali, il dominio e persino la sede fisica, non nascosti in fondo a un preview ma direttamente nei label dei nodi. La causa era doppia. La </w:t>
+      </w:r>
+      <w:r>
+        <w:rPr>
+          <w:rFonts w:ascii="Consolas" w:hAnsi="Consolas"/>
+        </w:rPr>
+        <w:t>anonymization_map</w:t>
+      </w:r>
+      <w:r>
+        <w:t xml:space="preserve"> veniva costruita da </w:t>
+      </w:r>
+      <w:r>
+        <w:rPr>
+          <w:rFonts w:ascii="Consolas" w:hAnsi="Consolas"/>
+        </w:rPr>
+        <w:t>enrich_graph.py</w:t>
+      </w:r>
+      <w:r>
+        <w:t xml:space="preserve"> ma non attraversava il confine fra </w:t>
+      </w:r>
+      <w:r>
+        <w:rPr>
+          <w:rFonts w:ascii="Consolas" w:hAnsi="Consolas"/>
+        </w:rPr>
+        <w:t>map_to_taxonomy.py</w:t>
+      </w:r>
+      <w:r>
+        <w:t xml:space="preserve"> e </w:t>
+      </w:r>
+      <w:r>
+        <w:rPr>
+          <w:rFonts w:ascii="Consolas" w:hAnsi="Consolas"/>
+        </w:rPr>
+        <w:t>export_to_taxonomy.py</w:t>
+      </w:r>
+      <w:r>
+        <w:t xml:space="preserve">, quindi arrivava all'export vuota; e comunque copriva solo le categorie </w:t>
+      </w:r>
+      <w:r>
+        <w:rPr>
+          <w:rFonts w:ascii="Consolas" w:hAnsi="Consolas"/>
+        </w:rPr>
+        <w:t>COMPANY</w:t>
+      </w:r>
+      <w:r>
+        <w:t xml:space="preserve"> e </w:t>
+      </w:r>
+      <w:r>
+        <w:rPr>
+          <w:rFonts w:ascii="Consolas" w:hAnsi="Consolas"/>
+        </w:rPr>
+        <w:t>PROPER_NOUN</w:t>
+      </w:r>
+      <w:r>
+        <w:t>, cioè ragioni sociali e nomi di persona, non le entità di rete.</w:t>
+      </w:r>
+    </w:p>
+    <w:p>
+      <w:pPr/>
+      <w:r>
+        <w:t xml:space="preserve">Il refactor ha toccato quattro punti della catena. </w:t>
+      </w:r>
+      <w:r>
+        <w:rPr>
+          <w:rFonts w:ascii="Consolas" w:hAnsi="Consolas"/>
+        </w:rPr>
+        <w:t>extract_entities.py</w:t>
+      </w:r>
+      <w:r>
+        <w:t xml:space="preserve"> ha imparato a estrarre </w:t>
+      </w:r>
+      <w:r>
+        <w:rPr>
+          <w:rFonts w:ascii="Consolas" w:hAnsi="Consolas"/>
+        </w:rPr>
+        <w:t>IP_ADDR</w:t>
+      </w:r>
+      <w:r>
+        <w:t>, nella forma dotted-quad con CIDR</w:t>
+      </w:r>
+      <w:r>
+        <w:rPr>
+          <w:rStyle w:val="Rimandonotaapidipagina"/>
+        </w:rPr>
+        <w:footnoteReference w:id="22"/>
+      </w:r>
+      <w:r>
+        <w:t xml:space="preserve"> opzionale, e </w:t>
+      </w:r>
+      <w:r>
+        <w:rPr>
+          <w:rFonts w:ascii="Consolas" w:hAnsi="Consolas"/>
+        </w:rPr>
+        <w:t>HOSTNAME</w:t>
+      </w:r>
+      <w:r>
+        <w:t xml:space="preserve">, riconosciuto dai prefissi ricorrenti del parco macchine (WIN, SRV, PC-, NAS, USG, VM) e dalla forma dashed uppercase, con una stoplist a contenere i falsi positivi. </w:t>
+      </w:r>
+      <w:r>
+        <w:rPr>
+          <w:rFonts w:ascii="Consolas" w:hAnsi="Consolas"/>
+        </w:rPr>
+        <w:t>enrich_graph.py</w:t>
+      </w:r>
+      <w:r>
+        <w:t xml:space="preserve"> ha esteso la mappa con i placeholder </w:t>
+      </w:r>
+      <w:r>
+        <w:rPr>
+          <w:rFonts w:ascii="Consolas" w:hAnsi="Consolas"/>
+        </w:rPr>
+        <w:t>[EMAIL_N]</w:t>
+      </w:r>
+      <w:r>
+        <w:t xml:space="preserve">, </w:t>
+      </w:r>
+      <w:r>
+        <w:rPr>
+          <w:rFonts w:ascii="Consolas" w:hAnsi="Consolas"/>
+        </w:rPr>
+        <w:t>[IP_N]</w:t>
+      </w:r>
+      <w:r>
+        <w:t xml:space="preserve"> e </w:t>
+      </w:r>
+      <w:r>
+        <w:rPr>
+          <w:rFonts w:ascii="Consolas" w:hAnsi="Consolas"/>
+        </w:rPr>
+        <w:t>[HOSTNAME_N]</w:t>
+      </w:r>
+      <w:r>
+        <w:t xml:space="preserve">. </w:t>
+      </w:r>
+      <w:r>
+        <w:rPr>
+          <w:rFonts w:ascii="Consolas" w:hAnsi="Consolas"/>
+        </w:rPr>
+        <w:t>map_to_taxonomy.py</w:t>
+      </w:r>
+      <w:r>
+        <w:t xml:space="preserve"> ha cominciato a propagare la mappa dentro il </w:t>
+      </w:r>
+      <w:r>
+        <w:rPr>
+          <w:rFonts w:ascii="Consolas" w:hAnsi="Consolas"/>
+        </w:rPr>
+        <w:t>taxonomy_diff.json</w:t>
+      </w:r>
+      <w:r>
+        <w:t xml:space="preserve">, chiudendo il buco di trasporto. E </w:t>
+      </w:r>
+      <w:r>
+        <w:rPr>
+          <w:rFonts w:ascii="Consolas" w:hAnsi="Consolas"/>
+        </w:rPr>
+        <w:t>export_to_taxonomy.py</w:t>
+      </w:r>
+      <w:r>
+        <w:t xml:space="preserve"> ha iniziato ad applicarla non solo al preview del body ma anche al label H3 dell'evidenza, al name H1 delle nuove Capability e al label della community.</w:t>
+      </w:r>
+    </w:p>
+    <w:p>
+      <w:pPr/>
+      <w:r>
+        <w:t xml:space="preserve">Due dettagli di quel commit meritano di essere ricordati perché non erano ovvi. Il primo è che lo slug e quindi il nome del file di una nuova Capability va rigenerato </w:t>
+      </w:r>
+      <w:r>
+        <w:rPr>
+          <w:i/>
+        </w:rPr>
+        <w:t>dopo</w:t>
+      </w:r>
+      <w:r>
+        <w:t xml:space="preserve"> l'anonimizzazione e non prima: generandolo dal name originale si otteneva un file pubblicato il cui nome conteneva l'IP che il corpo della pagina aveva diligentemente mascherato. Il secondo è la preservazione del line-ending. Lo script legge ora in binario ogni file esistente per rilevare se usa CRLF o LF e riscrive con lo stesso terminatore, campionando il line-ending del </w:t>
+      </w:r>
+      <w:r>
+        <w:rPr>
+          <w:rFonts w:ascii="Consolas" w:hAnsi="Consolas"/>
+        </w:rPr>
+        <w:t>docs-dir</w:t>
+      </w:r>
+      <w:r>
+        <w:t xml:space="preserve"> per i file creati da zero. Senza questo accorgimento un run su Windows convertiva in CRLF decine di file nati LF, e il diff su GitHub diventava illeggibile: centinaia di righe cambiate di cui nessuna con una modifica reale.</w:t>
+      </w:r>
+    </w:p>
+    <w:p>
+      <w:pPr/>
+      <w:r>
+        <w:t xml:space="preserve">Sopra tutto questo è stato costruito </w:t>
+      </w:r>
+      <w:r>
+        <w:rPr>
+          <w:rFonts w:ascii="Consolas" w:hAnsi="Consolas"/>
+        </w:rPr>
+        <w:t>sanitize_taxonomy_diff.py</w:t>
+      </w:r>
+      <w:r>
+        <w:t xml:space="preserve">, un gate obbligatorio fra la classificazione e l'export. La logica è la </w:t>
+      </w:r>
+      <w:r>
+        <w:rPr>
+          <w:i/>
+        </w:rPr>
+        <w:t>difesa in profondità</w:t>
+      </w:r>
+      <w:r>
+        <w:t>: la mappa è la prima linea, il gate è la seconda, e presuppone che la prima abbia fallito. Il gate scarta le entries che dopo anonimizzazione restano insignificanti, misurate sui soli caratteri alfanumerici al netto dei placeholder con soglia a dieci, e quelle in cui sopravvive un pattern residuo che la mappa non ha catturato, tipicamente per un mismatch di maiuscole. Per le nuove Capability filtra anche i nodi interni e scarta l'intera proposta se non ne sopravvive nessuno.</w:t>
+      </w:r>
+    </w:p>
+    <w:p>
+      <w:pPr/>
+      <w:r>
+        <w:t xml:space="preserve">L'esito del ciclo è stato di cinquantasei evidenze iniettate su undici pagine Capability, con un diff di </w:t>
+      </w:r>
+      <w:r>
+        <w:rPr>
+          <w:rFonts w:ascii="Consolas" w:hAnsi="Consolas"/>
+        </w:rPr>
+        <w:t>+551 / -6</w:t>
+      </w:r>
+      <w:r>
+        <w:t xml:space="preserve"> linee dove le sei rimozioni sono i placeholder "None yet" delle pagine fino ad allora vuote. Due nuove Capability sono state suggerite ma non pubblicate, sia perché i titoli conservavano un placeholder residuo </w:t>
+      </w:r>
+      <w:r>
+        <w:rPr>
+          <w:rFonts w:ascii="Consolas" w:hAnsi="Consolas"/>
+        </w:rPr>
+        <w:t>[IP_7]</w:t>
+      </w:r>
+      <w:r>
+        <w:t xml:space="preserve">, sia perché la semantica era di basso livello: "Winsrv2019 Vm" e "Windows Acl QTS" descrivono configurazioni, non competenze. Commit del repository pubblico </w:t>
+      </w:r>
+      <w:r>
+        <w:rPr>
+          <w:rFonts w:ascii="Consolas" w:hAnsi="Consolas"/>
+        </w:rPr>
+        <w:t>bbd361e</w:t>
+      </w:r>
+      <w:r>
+        <w:t>. Nella stessa sessione è stato installato nel virtualenv il modello NER</w:t>
+      </w:r>
+      <w:r>
+        <w:rPr>
+          <w:rStyle w:val="Rimandonotaapidipagina"/>
+        </w:rPr>
+        <w:footnoteReference w:id="23"/>
+      </w:r>
+      <w:r>
+        <w:t xml:space="preserve"> italiano </w:t>
+      </w:r>
+      <w:r>
+        <w:rPr>
+          <w:rFonts w:ascii="Consolas" w:hAnsi="Consolas"/>
+        </w:rPr>
+        <w:t>it_core_news_lg</w:t>
+      </w:r>
+      <w:r>
+        <w:t xml:space="preserve">, che risultava assente lasciando attivo il fallback a regex e stoplist, ed è stato aggiunto il parametro </w:t>
+      </w:r>
+      <w:r>
+        <w:rPr>
+          <w:rFonts w:ascii="Consolas" w:hAnsi="Consolas"/>
+        </w:rPr>
+        <w:t>-Account</w:t>
+      </w:r>
+      <w:r>
+        <w:t xml:space="preserve"> a </w:t>
+      </w:r>
+      <w:r>
+        <w:rPr>
+          <w:rFonts w:ascii="Consolas" w:hAnsi="Consolas"/>
+        </w:rPr>
+        <w:t>start_graphify.ps1</w:t>
+      </w:r>
+      <w:r>
+        <w:t xml:space="preserve"> per scegliere l'account Claude su una macchina che ne ha più di uno.</w:t>
+      </w:r>
+    </w:p>
+    <w:p>
+      <w:pPr/>
+      <w:r>
+        <w:t>Una nota di metodo che vale oltre il ciclo: la selezione del workspace sanitizzato è stata manuale, e tre sottocartelle sono state escluse a priori perché contenevano configurazioni di firewall Zyxel e report SECUREPORTER, identificate con un grep su credenziali, PSK</w:t>
+      </w:r>
+      <w:r>
+        <w:rPr>
+          <w:rStyle w:val="Rimandonotaapidipagina"/>
+        </w:rPr>
+        <w:footnoteReference w:id="24"/>
+      </w:r>
+      <w:r>
+        <w:t xml:space="preserve"> e indirizzi IP prima ancora di lanciare la pipeline. Il gate automatico esiste, ma non sostituisce lo sguardo su cosa si dà in pasto al sistema.</w:t>
+      </w:r>
+    </w:p>
+    <w:p>
+      <w:pPr>
+        <w:pStyle w:val="Titolo2"/>
+      </w:pPr>
+      <w:r>
+        <w:t>C.10 Nav MkDocs a tre livelli e il confine graphify (2026-07-15)</w:t>
+      </w:r>
+    </w:p>
+    <w:p>
+      <w:pPr/>
+      <w:r>
+        <w:t>Due interventi piccoli e indipendenti, entrambi nati da un vincolo implicito che si era irrigidito senza che nessuno lo avesse deciso.</w:t>
+      </w:r>
+    </w:p>
+    <w:p>
+      <w:pPr/>
+      <w:r>
+        <w:t xml:space="preserve">Il primo riguarda </w:t>
+      </w:r>
+      <w:r>
+        <w:rPr>
+          <w:rFonts w:ascii="Consolas" w:hAnsi="Consolas"/>
+        </w:rPr>
+        <w:t>generate_taxonomy_index.py</w:t>
+      </w:r>
+      <w:r>
+        <w:t xml:space="preserve">. La funzione </w:t>
+      </w:r>
+      <w:r>
+        <w:rPr>
+          <w:rFonts w:ascii="Consolas" w:hAnsi="Consolas"/>
+        </w:rPr>
+        <w:t>parse_nav</w:t>
+      </w:r>
+      <w:r>
+        <w:t xml:space="preserve"> assumeva che il nav di MkDocs fosse piatto, cioè Domain seguito direttamente dalle Capability foglia. Quando il sito pubblico ha introdotto un livello intermedio di sotto-area, l'indice si è semplicemente svuotato per quei rami. La funzione è stata riscritta con due helper, </w:t>
+      </w:r>
+      <w:r>
+        <w:rPr>
+          <w:rFonts w:ascii="Consolas" w:hAnsi="Consolas"/>
+        </w:rPr>
+        <w:t>_collect_leaves</w:t>
+      </w:r>
+      <w:r>
+        <w:t xml:space="preserve"> che scende ricorsivamente fino alle foglie e </w:t>
+      </w:r>
+      <w:r>
+        <w:rPr>
+          <w:rFonts w:ascii="Consolas" w:hAnsi="Consolas"/>
+        </w:rPr>
+        <w:t>_build_domain</w:t>
+      </w:r>
+      <w:r>
+        <w:t xml:space="preserve"> che costruisce il dizionario del domain, così da reggere sia la forma a due livelli sia quella a tre. Il </w:t>
+      </w:r>
+      <w:r>
+        <w:rPr>
+          <w:rFonts w:ascii="Consolas" w:hAnsi="Consolas"/>
+        </w:rPr>
+        <w:t>domain_dir</w:t>
+      </w:r>
+      <w:r>
+        <w:t xml:space="preserve"> viene calcolato in stile POSIX per non produrre indici diversi a seconda del sistema operativo. Il contratto verso il resto della pipeline non cambia: il </w:t>
+      </w:r>
+      <w:r>
+        <w:rPr>
+          <w:rFonts w:ascii="Consolas" w:hAnsi="Consolas"/>
+        </w:rPr>
+        <w:t>taxonomy_index.json</w:t>
+      </w:r>
+      <w:r>
+        <w:t xml:space="preserve"> conserva la stessa struttura </w:t>
+      </w:r>
+      <w:r>
+        <w:rPr>
+          <w:rFonts w:ascii="Consolas" w:hAnsi="Consolas"/>
+        </w:rPr>
+        <w:t>domains[*].capabilities[*]</w:t>
+      </w:r>
+      <w:r>
+        <w:t>, e nessuno script a valle si accorge della differenza.</w:t>
+      </w:r>
+    </w:p>
+    <w:p>
+      <w:pPr/>
+      <w:r>
+        <w:t xml:space="preserve">Il secondo è la versionatura di </w:t>
+      </w:r>
+      <w:r>
+        <w:rPr>
+          <w:rFonts w:ascii="Consolas" w:hAnsi="Consolas"/>
+        </w:rPr>
+        <w:t>.graphifyignore</w:t>
+      </w:r>
+      <w:r>
+        <w:t xml:space="preserve">. Il file esisteva ed era operativo da tempo, usato in tutte le sessioni graphify, ma non era tracciato da git: una lista di esclusione critica che viveva solo su disco, invisibile a qualsiasi review. È una copia intenzionale di </w:t>
+      </w:r>
+      <w:r>
+        <w:rPr>
+          <w:rFonts w:ascii="Consolas" w:hAnsi="Consolas"/>
+        </w:rPr>
+        <w:t>.gitignore</w:t>
+      </w:r>
+      <w:r>
+        <w:t xml:space="preserve"> con una sola differenza deliberata, l'assenza di </w:t>
+      </w:r>
+      <w:r>
+        <w:rPr>
+          <w:rFonts w:ascii="Consolas" w:hAnsi="Consolas"/>
+        </w:rPr>
+        <w:t>_intermediate/</w:t>
+      </w:r>
+      <w:r>
+        <w:t xml:space="preserve">, perché graphify deve poter indicizzare i sorgenti sanitizzati in </w:t>
+      </w:r>
+      <w:r>
+        <w:rPr>
+          <w:rFonts w:ascii="Consolas" w:hAnsi="Consolas"/>
+        </w:rPr>
+        <w:t>_intermediate/src/</w:t>
+      </w:r>
+      <w:r>
+        <w:t xml:space="preserve"> che invece git esclude per riservatezza. La divergenza fra due liste quasi identiche è però esattamente il tipo di errore che non si nota, quindi insieme al file è stata scritta in </w:t>
+      </w:r>
+      <w:r>
+        <w:rPr>
+          <w:rFonts w:ascii="Consolas" w:hAnsi="Consolas"/>
+        </w:rPr>
+        <w:t>CLAUDE.md</w:t>
+      </w:r>
+      <w:r>
+        <w:t xml:space="preserve"> una regola operativa che vincola l'allineamento manuale delle due e dichiara </w:t>
+      </w:r>
+      <w:r>
+        <w:rPr>
+          <w:rFonts w:ascii="Consolas" w:hAnsi="Consolas"/>
+        </w:rPr>
+        <w:t>_intermediate/</w:t>
+      </w:r>
+      <w:r>
+        <w:t xml:space="preserve"> come unica differenza ammessa. Ora, quando una lista viene toccata e l'altra no, il fatto compare nel diff.</w:t>
+      </w:r>
+    </w:p>
+    <w:p>
+      <w:pPr>
+        <w:pStyle w:val="Titolo2"/>
+      </w:pPr>
+      <w:r>
+        <w:t>C.11 Ciclo Cybersec governance baseline (2026-07-16)</w:t>
+      </w:r>
+    </w:p>
+    <w:p>
+      <w:pPr/>
+      <w:r>
+        <w:t xml:space="preserve">Il terzo ciclo ha affrontato il segmento </w:t>
+      </w:r>
+      <w:r>
+        <w:rPr>
+          <w:i/>
+        </w:rPr>
+        <w:t>Cybersecurity &amp; IT Governance</w:t>
+      </w:r>
+      <w:r>
+        <w:t xml:space="preserve">, ed è stato impostato deliberatamente come test piccolo su un corpus grande. La subfolder OneDrive di riferimento contiene quattrocentoquarantasette file testuali distribuiti su diciotto sottodirectory tematicamente eterogenee, dalla cifratura at-rest alla business continuity ai questionari fornitori. Mescolarle in un unico grafo avrebbe prodotto una community detection incoerente e una review manuale ingestibile, quindi la selezione è stata fatta per </w:t>
+      </w:r>
+      <w:r>
+        <w:rPr>
+          <w:i/>
+        </w:rPr>
+        <w:t>coesione semantica</w:t>
+      </w:r>
+      <w:r>
+        <w:t xml:space="preserve"> e non per volume: tre subfolder che insieme formano un blocco governance e policy compatto, e dentro quelle una scelta manuale di cinque documenti di policy generale.</w:t>
+      </w:r>
+    </w:p>
+    <w:p>
+      <w:pPr/>
+      <w:r>
+        <w:t xml:space="preserve">Le esclusioni sono più istruttive delle inclusioni. Sono rimasti fuori </w:t>
+      </w:r>
+      <w:r>
+        <w:rPr>
+          <w:rFonts w:ascii="Consolas" w:hAnsi="Consolas"/>
+        </w:rPr>
+        <w:t>Registro_accettazione.docx</w:t>
+      </w:r>
+      <w:r>
+        <w:t xml:space="preserve"> perché contiene firme di dipendenti, </w:t>
+      </w:r>
+      <w:r>
+        <w:rPr>
+          <w:rFonts w:ascii="Consolas" w:hAnsi="Consolas"/>
+        </w:rPr>
+        <w:t>Data Branch-bando.docx</w:t>
+      </w:r>
+      <w:r>
+        <w:t xml:space="preserve"> perché è un caso specifico e non una procedura, il duplicato più vecchio di </w:t>
+      </w:r>
+      <w:r>
+        <w:rPr>
+          <w:rFonts w:ascii="Consolas" w:hAnsi="Consolas"/>
+        </w:rPr>
+        <w:t>Configurazione-PC-Password.docx</w:t>
+      </w:r>
+      <w:r>
+        <w:t xml:space="preserve">, tutti i </w:t>
+      </w:r>
+      <w:r>
+        <w:rPr>
+          <w:rFonts w:ascii="Consolas" w:hAnsi="Consolas"/>
+        </w:rPr>
+        <w:t>.pdf</w:t>
+      </w:r>
+      <w:r>
+        <w:t xml:space="preserve"> che la pipeline non processa, e il </w:t>
+      </w:r>
+      <w:r>
+        <w:rPr>
+          <w:rFonts w:ascii="Consolas" w:hAnsi="Consolas"/>
+        </w:rPr>
+        <w:t>Registro_Data_Breach.xlsx</w:t>
+      </w:r>
+      <w:r>
+        <w:t xml:space="preserve"> che è insieme non processabile e pieno di dati personali per definizione.</w:t>
+      </w:r>
+    </w:p>
+    <w:p>
+      <w:pPr/>
+      <w:r>
+        <w:t xml:space="preserve">I numeri del ciclo. Graphify ha prodotto settantacinque nodi, centodue link e cinque community. La mappa di anonimizzazione si è fermata a cinque voci, ed è un dato interessante di per sé: zero aziende, zero IP, zero hostname, una email pubblica di supporto Microsoft e quattro voci </w:t>
+      </w:r>
+      <w:r>
+        <w:rPr>
+          <w:rFonts w:ascii="Consolas" w:hAnsi="Consolas"/>
+        </w:rPr>
+        <w:t>PERSONA</w:t>
+      </w:r>
+      <w:r>
+        <w:t xml:space="preserve">, di cui tre falsi positivi del NER su testo di intestazione e una sola vera, il ruolo "Amministratore di Sistema". Un corpus di policy interne, a differenza di uno infrastrutturale, quasi non contiene entità da mascherare. La classificazione ha dato trentasei fit, una nuova Capability proposta, cinque nuovi Domain e venticinque nodi non classificati. Il gate di sanitizzazione ne ha tenuti trentaquattro, scartando "Amministratore di Sistema" e "Area IT" perché dopo anonimizzazione restavano sotto la soglia dei dieci caratteri alfanumerici. L'export ha prodotto trenta iniezioni su cinque Capability, </w:t>
+      </w:r>
+      <w:r>
+        <w:rPr>
+          <w:rFonts w:ascii="Consolas" w:hAnsi="Consolas"/>
+        </w:rPr>
+        <w:t>+298 / -2</w:t>
+      </w:r>
+      <w:r>
+        <w:t xml:space="preserve"> linee, e il commit </w:t>
+      </w:r>
+      <w:r>
+        <w:rPr>
+          <w:rFonts w:ascii="Consolas" w:hAnsi="Consolas"/>
+        </w:rPr>
+        <w:t>5f2af1c</w:t>
+      </w:r>
+      <w:r>
+        <w:t xml:space="preserve"> sul repository pubblico.</w:t>
+      </w:r>
+    </w:p>
+    <w:p>
+      <w:pPr/>
+      <w:r>
+        <w:t xml:space="preserve">La review manuale è però stata pesante, ed è il vero risultato del ciclo. Diciotto fit su trentaquattro sono stati spostati a mano da </w:t>
+      </w:r>
+      <w:r>
+        <w:rPr>
+          <w:rFonts w:ascii="Consolas" w:hAnsi="Consolas"/>
+        </w:rPr>
+        <w:t>quality-certification</w:t>
+      </w:r>
+      <w:r>
+        <w:t xml:space="preserve"> a </w:t>
+      </w:r>
+      <w:r>
+        <w:rPr>
+          <w:rFonts w:ascii="Consolas" w:hAnsi="Consolas"/>
+        </w:rPr>
+        <w:t>cybersecurity-it-governance</w:t>
+      </w:r>
+      <w:r>
+        <w:t xml:space="preserve">, e altri quattro sono stati rimossi perché palesemente fuori posto: </w:t>
+      </w:r>
+      <w:r>
+        <w:rPr>
+          <w:rFonts w:ascii="Consolas" w:hAnsi="Consolas"/>
+        </w:rPr>
+        <w:t>gpedit.msc</w:t>
+      </w:r>
+      <w:r>
+        <w:t xml:space="preserve"> finito in </w:t>
+      </w:r>
+      <w:r>
+        <w:rPr>
+          <w:i/>
+        </w:rPr>
+        <w:t>Ad-hoc Internal Development</w:t>
+      </w:r>
+      <w:r>
+        <w:t xml:space="preserve">, un sistema di filtri di categorie di siti in </w:t>
+      </w:r>
+      <w:r>
+        <w:rPr>
+          <w:i/>
+        </w:rPr>
+        <w:t>IT Administration &amp; Billing</w:t>
+      </w:r>
+      <w:r>
+        <w:t xml:space="preserve">, il server aziendale e il backup dati in </w:t>
+      </w:r>
+      <w:r>
+        <w:rPr>
+          <w:i/>
+        </w:rPr>
+        <w:t>Cloud Platforms</w:t>
+      </w:r>
+      <w:r>
+        <w:t>. Tutti i nuovi Domain e la nuova Capability sono stati scartati per punteggio troppo basso, nodo singolo o label di community rumorosa. Metà delle evidenze pubblicate, in altre parole, è passata da una correzione umana. Un ciclo che richiede quel livello di intervento non è ripetibile, ed è da qui che nascono le due scoperte descritte in C.12.</w:t>
+      </w:r>
+    </w:p>
+    <w:p>
+      <w:pPr>
+        <w:pStyle w:val="Titolo2"/>
+      </w:pPr>
+      <w:r>
+        <w:t>C.12 Chiusura del debito e correzione delle due scoperte (2026-07-27)</w:t>
+      </w:r>
+    </w:p>
+    <w:p>
+      <w:pPr/>
+      <w:r>
+        <w:t>Questa sezione chiude un debito documentale di circa due mesi: l'ultimo allineamento del diario risaliva al 2026-05-28, mentre nel frattempo erano entrati i tre cicli descritti in C.9, C.10 e C.11. La sessione ha aggredito le due scoperte lasciate aperte dal ciclo Cybersec, e in un caso ha dovuto correggere la diagnosi che ne era stata data a caldo.</w:t>
+      </w:r>
+    </w:p>
+    <w:p>
+      <w:pPr>
+        <w:pStyle w:val="Titolo3"/>
+      </w:pPr>
+      <w:r>
+        <w:t>Il filtro dei nomi di graphify</w:t>
+      </w:r>
+    </w:p>
+    <w:p>
+      <w:pPr/>
+      <w:r>
+        <w:t xml:space="preserve">La prima scoperta era che graphify 0.8.14 scarta i file il cui nome contiene </w:t>
+      </w:r>
+      <w:r>
+        <w:rPr>
+          <w:rFonts w:ascii="Consolas" w:hAnsi="Consolas"/>
+        </w:rPr>
+        <w:t>password</w:t>
+      </w:r>
+      <w:r>
+        <w:t xml:space="preserve">, </w:t>
+      </w:r>
+      <w:r>
+        <w:rPr>
+          <w:rFonts w:ascii="Consolas" w:hAnsi="Consolas"/>
+        </w:rPr>
+        <w:t>credential</w:t>
+      </w:r>
+      <w:r>
+        <w:t xml:space="preserve">, </w:t>
+      </w:r>
+      <w:r>
+        <w:rPr>
+          <w:rFonts w:ascii="Consolas" w:hAnsi="Consolas"/>
+        </w:rPr>
+        <w:t>secret</w:t>
+      </w:r>
+      <w:r>
+        <w:t xml:space="preserve">, </w:t>
+      </w:r>
+      <w:r>
+        <w:rPr>
+          <w:rFonts w:ascii="Consolas" w:hAnsi="Consolas"/>
+        </w:rPr>
+        <w:t>token</w:t>
+      </w:r>
+      <w:r>
+        <w:t xml:space="preserve"> o </w:t>
+      </w:r>
+      <w:r>
+        <w:rPr>
+          <w:rFonts w:ascii="Consolas" w:hAnsi="Consolas"/>
+        </w:rPr>
+        <w:t>private_key</w:t>
+      </w:r>
+      <w:r>
+        <w:t xml:space="preserve">, oltre alle estensioni di materiale crittografico e ai file sotto directory di segreti note. È una protezione ragionevole sul caso d'uso generale e diventa un falso positivo sistematico sul nostro: una policy IT aziendale si chiama per forza di cose "Configurazione-password-Windows", ed è esattamente il documento da indicizzare. Il punto grave non è lo scarto ma la sua invisibilità. Il campo diagnostico </w:t>
+      </w:r>
+      <w:r>
+        <w:rPr>
+          <w:rFonts w:ascii="Consolas" w:hAnsi="Consolas"/>
+        </w:rPr>
+        <w:t>skipped_sensitive</w:t>
+      </w:r>
+      <w:r>
+        <w:t xml:space="preserve"> esiste, ma nel ciclo Cybersec è risultato vuoto, perché si popola in un loop a valle di un pre-detect che aveva già concluso </w:t>
+      </w:r>
+      <w:r>
+        <w:rPr>
+          <w:rFonts w:ascii="Consolas" w:hAnsi="Consolas"/>
+        </w:rPr>
+        <w:t>total_files: 0</w:t>
+      </w:r>
+      <w:r>
+        <w:t xml:space="preserve">; la sessione ha quindi deciso </w:t>
+      </w:r>
+      <w:r>
+        <w:rPr>
+          <w:rFonts w:ascii="Consolas" w:hAnsi="Consolas"/>
+        </w:rPr>
+        <w:t>needs_graph: false</w:t>
+      </w:r>
+      <w:r>
+        <w:t xml:space="preserve"> senza eseguire nulla, e tre documenti su cinque sono spariti senza lasciare traccia.</w:t>
+      </w:r>
+    </w:p>
+    <w:p>
+      <w:pPr/>
+      <w:r>
+        <w:t xml:space="preserve">Il workaround adottato allora era stato una cartella parallela con i file rinominati a mano e convertiti in Markdown. Ora quel passo è uno script, </w:t>
+      </w:r>
+      <w:r>
+        <w:rPr>
+          <w:rFonts w:ascii="Consolas" w:hAnsi="Consolas"/>
+        </w:rPr>
+        <w:t>scripts/prepare_graphify_source.py</w:t>
+      </w:r>
+      <w:r>
+        <w:t xml:space="preserve">. In modalità di sola verifica, che è il default, elenca quali file graphify scarterebbe e con quale nome verrebbero sostituiti, senza scrivere nulla. Con </w:t>
+      </w:r>
+      <w:r>
+        <w:rPr>
+          <w:rFonts w:ascii="Consolas" w:hAnsi="Consolas"/>
+        </w:rPr>
+        <w:t>--apply</w:t>
+      </w:r>
+      <w:r>
+        <w:t xml:space="preserve"> genera la cartella </w:t>
+      </w:r>
+      <w:r>
+        <w:rPr>
+          <w:rFonts w:ascii="Consolas" w:hAnsi="Consolas"/>
+        </w:rPr>
+        <w:t>&lt;nome&gt;-sanitized/</w:t>
+      </w:r>
+      <w:r>
+        <w:t xml:space="preserve"> con i documenti convertiti in Markdown riusando </w:t>
+      </w:r>
+      <w:r>
+        <w:rPr>
+          <w:rFonts w:ascii="Consolas" w:hAnsi="Consolas"/>
+        </w:rPr>
+        <w:t>parse_docx.py</w:t>
+      </w:r>
+      <w:r>
+        <w:t>, i nomi neutralizzati secondo una mappa esplicita in italiano, e il frontmatter di tracciabilità che registra il file di origine, la subfolder e la data. Il filtro di graphify è replicato e non importato, perché graphify vive in un virtualenv pipx separato e perché un cambiamento delle sue regole deve rompere qui in modo visibile invece di alterare in silenzio il comportamento della pipeline.</w:t>
+      </w:r>
+    </w:p>
+    <w:p>
+      <w:pPr/>
+      <w:r>
+        <w:t xml:space="preserve">Due scelte di merito. La prima è che si neutralizza il nome, mai il contenuto: il corpo del documento continua a dire "password" ovunque, e la protezione contro la fuga di dati resta interamente affidata alla catena di anonimizzazione e al gate residue, che questo passo non sostituisce né indebolisce. Il problema risolto è di </w:t>
+      </w:r>
+      <w:r>
+        <w:rPr>
+          <w:i/>
+        </w:rPr>
+        <w:t>indicizzabilità</w:t>
+      </w:r>
+      <w:r>
+        <w:t>, non di riservatezza. La seconda è che i file di vero materiale crittografico, riconosciuti per estensione, non vengono rinominati affatto: lì il filtro di graphify ha ragione e restano fuori dal corpus. Come verifica di ritorno lo script rilegge l'output e rilancia il filtro sui nomi appena scritti, uscendo con codice due se un file lo attiva ancora, così la mappa di sostituzione non può fallire in silenzio. La validazione è stata fatta contro la cartella prodotta a mano il 16 luglio: i cinque nomi generati coincidono esattamente con quelli scelti allora.</w:t>
+      </w:r>
+    </w:p>
+    <w:p>
+      <w:pPr>
+        <w:pStyle w:val="Titolo3"/>
+      </w:pPr>
+      <w:r>
+        <w:t>Il misrouting delle evidenze GDPR, e perché la diagnosi era sbagliata</w:t>
+      </w:r>
+    </w:p>
+    <w:p>
+      <w:pPr/>
+      <w:r>
+        <w:t xml:space="preserve">La seconda scoperta era stata annotata come una keyword </w:t>
+      </w:r>
+      <w:r>
+        <w:rPr>
+          <w:rFonts w:ascii="Consolas" w:hAnsi="Consolas"/>
+        </w:rPr>
+        <w:t>certification</w:t>
+      </w:r>
+      <w:r>
+        <w:t xml:space="preserve"> troppo generica nel vocabolario di </w:t>
+      </w:r>
+      <w:r>
+        <w:rPr>
+          <w:i/>
+        </w:rPr>
+        <w:t>Quality Certification</w:t>
+      </w:r>
+      <w:r>
+        <w:t xml:space="preserve">, che catturerebbe come falsi positivi i nodi che parlano di certificazione, Regolamento, WP250 e Provvedimento. L'indagine di oggi mostra che questa spiegazione non regge: </w:t>
+      </w:r>
+      <w:r>
+        <w:rPr>
+          <w:rFonts w:ascii="Consolas" w:hAnsi="Consolas"/>
+        </w:rPr>
+        <w:t>certification</w:t>
+      </w:r>
+      <w:r>
+        <w:t xml:space="preserve"> compare nel vocabolario di entrambe le pagine e non ha mai deciso un solo match. La causa vera è duplice.</w:t>
+      </w:r>
+    </w:p>
+    <w:p>
+      <w:pPr/>
+      <w:r>
+        <w:t xml:space="preserve">Il primo fattore è un bug reale in </w:t>
+      </w:r>
+      <w:r>
+        <w:rPr>
+          <w:rFonts w:ascii="Consolas" w:hAnsi="Consolas"/>
+        </w:rPr>
+        <w:t>generate_taxonomy_index.py</w:t>
+      </w:r>
+      <w:r>
+        <w:t xml:space="preserve">. Le keyword di una Capability venivano estratte concatenando la sezione Technologies and tools e la sezione Overview, e la lista risultante veniva poi tagliata alle prime sessanta voci. Su una pagina con una sezione tecnica lunga il taglio non toglieva la coda di entrambe le sezioni: eliminava per intero il contributo della seconda, cioè proprio l'Overview, che è la sezione dove una pagina dichiara il proprio perimetro. Sulla pagina </w:t>
+      </w:r>
+      <w:r>
+        <w:rPr>
+          <w:i/>
+        </w:rPr>
+        <w:t>Cybersecurity &amp; IT Governance</w:t>
+      </w:r>
+      <w:r>
+        <w:t xml:space="preserve"> il taglio faceva sparire </w:t>
+      </w:r>
+      <w:r>
+        <w:rPr>
+          <w:rFonts w:ascii="Consolas" w:hAnsi="Consolas"/>
+        </w:rPr>
+        <w:t>gdpr</w:t>
+      </w:r>
+      <w:r>
+        <w:t xml:space="preserve">, </w:t>
+      </w:r>
+      <w:r>
+        <w:rPr>
+          <w:rFonts w:ascii="Consolas" w:hAnsi="Consolas"/>
+        </w:rPr>
+        <w:t>penetration</w:t>
+      </w:r>
+      <w:r>
+        <w:t xml:space="preserve">, </w:t>
+      </w:r>
+      <w:r>
+        <w:rPr>
+          <w:rFonts w:ascii="Consolas" w:hAnsi="Consolas"/>
+        </w:rPr>
+        <w:t>testing</w:t>
+      </w:r>
+      <w:r>
+        <w:t xml:space="preserve"> e </w:t>
+      </w:r>
+      <w:r>
+        <w:rPr>
+          <w:rFonts w:ascii="Consolas" w:hAnsi="Consolas"/>
+        </w:rPr>
+        <w:t>malware</w:t>
+      </w:r>
+      <w:r>
+        <w:t>, ovvero i termini che la distinguono dalle vicine. Cinque Capability su trentuno erano in questa condizione. La correzione fonde le due sezioni alternandole a giro invece di concatenarle, così il taglio non può azzerare nessuna delle due, e stampa un avviso su standard error che elenca le pagine troncate e di quanti token, perché il troncamento silenzioso è precisamente ciò che ha reso il problema invisibile per tre cicli.</w:t>
+      </w:r>
+    </w:p>
+    <w:p>
+      <w:pPr/>
+      <w:r>
+        <w:t xml:space="preserve">Il secondo fattore, e quello davvero decisivo, non era un bug affatto. Il token che decideva il match era </w:t>
+      </w:r>
+      <w:r>
+        <w:rPr>
+          <w:rFonts w:ascii="Consolas" w:hAnsi="Consolas"/>
+        </w:rPr>
+        <w:t>breach</w:t>
+      </w:r>
+      <w:r>
+        <w:t xml:space="preserve">, presente nel vocabolario di </w:t>
+      </w:r>
+      <w:r>
+        <w:rPr>
+          <w:i/>
+        </w:rPr>
+        <w:t>Quality Certification</w:t>
+      </w:r>
+      <w:r>
+        <w:t xml:space="preserve"> e assente da quello di </w:t>
+      </w:r>
+      <w:r>
+        <w:rPr>
+          <w:i/>
+        </w:rPr>
+        <w:t>Cybersecurity &amp; IT Governance</w:t>
+      </w:r>
+      <w:r>
+        <w:t xml:space="preserve">, per il semplice motivo che la prima pagina dichiarava nel proprio Overview "GDPR data-breach handling" e nelle Technologies "GDPR + Italian Legislative Decree 51/2018, data breach register", mentre la seconda si limitava a "regulatory compliance (GDPR, ISO/IEC 27001 implementation path)" senza nominare mai il data breach. Lo scoring stava leggendo correttamente due pagine che si contendevano lo stesso perimetro, e assegnava le evidenze a quella che rivendicava il termine specifico. Non c'era niente da correggere nel codice: c'era una decisione di </w:t>
+      </w:r>
+      <w:r>
+        <w:rPr>
+          <w:i/>
+        </w:rPr>
+        <w:t>proprietà</w:t>
+      </w:r>
+      <w:r>
+        <w:t xml:space="preserve"> da prendere nella tassonomia.</w:t>
+      </w:r>
+    </w:p>
+    <w:p>
+      <w:pPr/>
+      <w:r>
+        <w:t xml:space="preserve">La decisione presa è che il perimetro GDPR e data breach appartiene a </w:t>
+      </w:r>
+      <w:r>
+        <w:rPr>
+          <w:i/>
+        </w:rPr>
+        <w:t>Cybersecurity &amp; IT Governance</w:t>
+      </w:r>
+      <w:r>
+        <w:t xml:space="preserve">. Le due pagine pubbliche sono state riscritte di conseguenza, spostando il vocabolario di risposta al data breach, cioè registro, notifica al Garante entro settantadue ore, articoli 33 e 34, comunicazione agli interessati, nell'Overview e nelle Technologies della pagina di sicurezza. Su </w:t>
+      </w:r>
+      <w:r>
+        <w:rPr>
+          <w:i/>
+        </w:rPr>
+        <w:t>Quality Certification</w:t>
+      </w:r>
+      <w:r>
+        <w:t xml:space="preserve"> la rivendicazione è stata rimossa dalle due sezioni che alimentano il matching, ma il contributo reale resta documentato nella sezione Responsibilities, che non concorre alle keyword, con un rimando esplicito alla pagina che ora possiede il processo. La pagina continua quindi a dire il vero su cosa è stato fatto, senza più attrarre le evidenze.</w:t>
+      </w:r>
+    </w:p>
+    <w:p>
+      <w:pPr/>
+      <w:r>
+        <w:t xml:space="preserve">Il risultato è verificabile sul corpus del ciclo chiuso. Prima, la classificazione automatica mandava diciotto evidenze a </w:t>
+      </w:r>
+      <w:r>
+        <w:rPr>
+          <w:i/>
+        </w:rPr>
+        <w:t>Quality Certification</w:t>
+      </w:r>
+      <w:r>
+        <w:t xml:space="preserve"> e una sola a </w:t>
+      </w:r>
+      <w:r>
+        <w:rPr>
+          <w:i/>
+        </w:rPr>
+        <w:t>Cybersecurity &amp; IT Governance</w:t>
+      </w:r>
+      <w:r>
+        <w:t xml:space="preserve">, e serviva la correzione manuale di diciotto fit per ottenere il risultato giusto. Dopo, l'automatismo ne manda venti a </w:t>
+      </w:r>
+      <w:r>
+        <w:rPr>
+          <w:i/>
+        </w:rPr>
+        <w:t>Cybersecurity &amp; IT Governance</w:t>
+      </w:r>
+      <w:r>
+        <w:t xml:space="preserve"> e zero a </w:t>
+      </w:r>
+      <w:r>
+        <w:rPr>
+          <w:i/>
+        </w:rPr>
+        <w:t>Quality Certification</w:t>
+      </w:r>
+      <w:r>
+        <w:t xml:space="preserve">, riproducendo da solo ciò che l'essere umano aveva dovuto imporre a mano. Vale la pena notare che il pubblicato era già corretto: la revisione manuale obbligatoria del </w:t>
+      </w:r>
+      <w:r>
+        <w:rPr>
+          <w:rFonts w:ascii="Consolas" w:hAnsi="Consolas"/>
+        </w:rPr>
+        <w:t>taxonomy_diff.md</w:t>
+      </w:r>
+      <w:r>
+        <w:t xml:space="preserve"> aveva fatto il suo lavoro. Il costo che questa correzione elimina non è un errore sul sito, è la necessità di rifare quella stessa correzione a ogni ciclo futuro.</w:t>
+      </w:r>
+    </w:p>
+    <w:p>
+      <w:pPr/>
+      <w:r>
+        <w:t xml:space="preserve">Un terzo intervento minore è nato per contraccolpo. Rendendo equo il taglio a sessanta keyword, la pagina di sicurezza cominciava a perdere </w:t>
+      </w:r>
+      <w:r>
+        <w:rPr>
+          <w:rFonts w:ascii="Consolas" w:hAnsi="Consolas"/>
+        </w:rPr>
+        <w:t>nessus</w:t>
+      </w:r>
+      <w:r>
+        <w:t xml:space="preserve">, </w:t>
+      </w:r>
+      <w:r>
+        <w:rPr>
+          <w:rFonts w:ascii="Consolas" w:hAnsi="Consolas"/>
+        </w:rPr>
+        <w:t>esxi</w:t>
+      </w:r>
+      <w:r>
+        <w:t xml:space="preserve"> e </w:t>
+      </w:r>
+      <w:r>
+        <w:rPr>
+          <w:rFonts w:ascii="Consolas" w:hAnsi="Consolas"/>
+        </w:rPr>
+        <w:t>vcenter</w:t>
+      </w:r>
+      <w:r>
+        <w:t xml:space="preserve">, cioè vocabolario tecnico legittimo. Uno sweep del tetto a sessanta, novanta, centoventi e senza tetto sullo stesso corpus ha prodotto la stessa identica classificazione in tutti e quattro i casi: il tetto non è un parametro di tuning con effetto osservabile, è solo una guardia contro una pagina patologicamente lunga, che avrebbe punteggi alti per sola cardinalità del proprio vocabolario. È stato quindi portato a novanta, valore che sul nav attuale lascia intatte tutte le pagine tranne </w:t>
+      </w:r>
+      <w:r>
+        <w:rPr>
+          <w:i/>
+        </w:rPr>
+        <w:t>System Administration</w:t>
+      </w:r>
+      <w:r>
+        <w:t>, che ne perde quattro.</w:t>
+      </w:r>
+    </w:p>
+    <w:p>
+      <w:pPr>
+        <w:pStyle w:val="Titolo3"/>
+      </w:pPr>
+      <w:r>
+        <w:t>Un residuo di amplificazione, non risolto</w:t>
+      </w:r>
+    </w:p>
+    <w:p>
+      <w:pPr/>
+      <w:r>
+        <w:t xml:space="preserve">Resta sul tavolo un terzo meccanismo, individuato ma non affrontato. </w:t>
+      </w:r>
+      <w:r>
+        <w:rPr>
+          <w:rFonts w:ascii="Consolas" w:hAnsi="Consolas"/>
+        </w:rPr>
+        <w:t>classify_nodes</w:t>
+      </w:r>
+      <w:r>
+        <w:t xml:space="preserve"> unisce ai token del nodo anche i token del nome della sua community, e nel ciclo Cybersec questo significava iniettare </w:t>
+      </w:r>
+      <w:r>
+        <w:rPr>
+          <w:rFonts w:ascii="Consolas" w:hAnsi="Consolas"/>
+        </w:rPr>
+        <w:t>allegato</w:t>
+      </w:r>
+      <w:r>
+        <w:t xml:space="preserve">, </w:t>
+      </w:r>
+      <w:r>
+        <w:rPr>
+          <w:rFonts w:ascii="Consolas" w:hAnsi="Consolas"/>
+        </w:rPr>
+        <w:t>breach</w:t>
+      </w:r>
+      <w:r>
+        <w:t xml:space="preserve">, </w:t>
+      </w:r>
+      <w:r>
+        <w:rPr>
+          <w:rFonts w:ascii="Consolas" w:hAnsi="Consolas"/>
+        </w:rPr>
+        <w:t>comunicazione</w:t>
+      </w:r>
+      <w:r>
+        <w:t xml:space="preserve">, </w:t>
+      </w:r>
+      <w:r>
+        <w:rPr>
+          <w:rFonts w:ascii="Consolas" w:hAnsi="Consolas"/>
+        </w:rPr>
+        <w:t>data</w:t>
+      </w:r>
+      <w:r>
+        <w:t xml:space="preserve">, </w:t>
+      </w:r>
+      <w:r>
+        <w:rPr>
+          <w:rFonts w:ascii="Consolas" w:hAnsi="Consolas"/>
+        </w:rPr>
+        <w:t>interna</w:t>
+      </w:r>
+      <w:r>
+        <w:t xml:space="preserve"> e </w:t>
+      </w:r>
+      <w:r>
+        <w:rPr>
+          <w:rFonts w:ascii="Consolas" w:hAnsi="Consolas"/>
+        </w:rPr>
+        <w:t>modulo</w:t>
+      </w:r>
+      <w:r>
+        <w:t xml:space="preserve"> in ogni singolo nodo di quella community. Su un nodo il cui label produce tre o quattro token, sei token vengono quindi dalla community e non dal nodo: l'effetto è che l'intera community si muove in blocco verso la stessa destinazione invece che essere valutata nodo per nodo. È il motivo per cui l'errore, quando si verifica, non riguarda mai una evidenza sola ma diciotto insieme. Se sia un difetto o un comportamento voluto dipende da quanto si crede alla community detection, e la valutazione è rimandata a un ciclo in cui il fenomeno produca un errore osservabile.</w:t>
+      </w:r>
+    </w:p>
+    <w:p>
+      <w:pPr>
+        <w:pStyle w:val="Titolo3"/>
+      </w:pPr>
+      <w:r>
+        <w:t>Tooling del diario</w:t>
+      </w:r>
+    </w:p>
+    <w:p>
+      <w:pPr/>
+      <w:r>
+        <w:t xml:space="preserve">Infine, la procedura di aggiornamento di questo documento è diventata due script. </w:t>
+      </w:r>
+      <w:r>
+        <w:rPr>
+          <w:rFonts w:ascii="Consolas" w:hAnsi="Consolas"/>
+        </w:rPr>
+        <w:t>scripts/open_diary.ps1</w:t>
+      </w:r>
+      <w:r>
+        <w:t xml:space="preserve"> apre il </w:t>
+      </w:r>
+      <w:r>
+        <w:rPr>
+          <w:rFonts w:ascii="Consolas" w:hAnsi="Consolas"/>
+        </w:rPr>
+        <w:t>.docx</w:t>
+      </w:r>
+      <w:r>
+        <w:t xml:space="preserve"> in Word ed elenca i draft più recenti presenti nello scratchpad di sessione, così che chi edita sappia cosa incollare. </w:t>
+      </w:r>
+      <w:r>
+        <w:rPr>
+          <w:rFonts w:ascii="Consolas" w:hAnsi="Consolas"/>
+        </w:rPr>
+        <w:t>scripts/finalize_diary.ps1</w:t>
+      </w:r>
+      <w:r>
+        <w:t xml:space="preserve"> chiude il ciclo: rigenera il </w:t>
+      </w:r>
+      <w:r>
+        <w:rPr>
+          <w:rFonts w:ascii="Consolas" w:hAnsi="Consolas"/>
+        </w:rPr>
+        <w:t>.md</w:t>
+      </w:r>
+      <w:r>
+        <w:t xml:space="preserve"> invocando </w:t>
+      </w:r>
+      <w:r>
+        <w:rPr>
+          <w:rFonts w:ascii="Consolas" w:hAnsi="Consolas"/>
+        </w:rPr>
+        <w:t>sync_diary_md.py</w:t>
+      </w:r>
+      <w:r>
+        <w:t xml:space="preserve">, mostra il diff del solo </w:t>
+      </w:r>
+      <w:r>
+        <w:rPr>
+          <w:rFonts w:ascii="Consolas" w:hAnsi="Consolas"/>
+        </w:rPr>
+        <w:t>.md</w:t>
+      </w:r>
+      <w:r>
+        <w:t xml:space="preserve"> come review testuale che un binario non consente, e stampa i comandi git nel doppio blocco PowerShell e bash. Nessuno dei due esegue git, che resta manuale per politica di progetto. In </w:t>
+      </w:r>
+      <w:r>
+        <w:rPr>
+          <w:rFonts w:ascii="Consolas" w:hAnsi="Consolas"/>
+        </w:rPr>
+        <w:t>CLAUDE.md</w:t>
+      </w:r>
+      <w:r>
+        <w:t xml:space="preserve"> sono stati aggiunti tre momenti in cui l'agente ricorda da solo di aggiornare il diario: a fine ciclo di ingest, all'apertura di sessione quando il ritardo supera i sette giorni, e a valle di un refactor architetturale. Il debito che questa sezione chiude è esattamente ciò che quei promemoria esistono per prevenire.</w:t>
       </w:r>
     </w:p>
     <w:p>
@@ -15749,6 +16962,123 @@
           <w:szCs w:val="18"/>
         </w:rPr>
         <w:t>Un asset statico e', in senso tecnico, un file che il server web serve esattamente com'e' su disco, senza elaborazione server-side. In MkDocs, qualsiasi file nella cartella docs/ che non sia un file .md viene copiato nella directory di output _site/ durante la build, mantenendo il percorso relativo. Un file docs/graphify-out/graph.html diventa quindi accessibile all'URL /graphify-out/graph.html del sito pubblicato, senza che MkDocs lo elabori o lo trasformi.</w:t>
+      </w:r>
+    </w:p>
+  </w:footnote>
+  <w:footnote w:id="22">
+    <w:p>
+      <w:pPr>
+        <w:spacing w:after="40"/>
+        <w:jc w:val="both"/>
+      </w:pPr>
+      <w:r>
+        <w:rPr>
+          <w:rStyle w:val="Rimandonotaapidipagina"/>
+        </w:rPr>
+        <w:footnoteRef/>
+      </w:r>
+      <w:r>
+        <w:rPr>
+          <w:color w:val="595959"/>
+          <w:sz w:val="18"/>
+          <w:szCs w:val="18"/>
+        </w:rPr>
+        <w:t xml:space="preserve"> </w:t>
+      </w:r>
+      <w:r>
+        <w:rPr>
+          <w:i/>
+          <w:color w:val="595959"/>
+          <w:sz w:val="18"/>
+          <w:szCs w:val="18"/>
+        </w:rPr>
+        <w:t xml:space="preserve">CIDR</w:t>
+      </w:r>
+      <w:r>
+        <w:rPr>
+          <w:color w:val="595959"/>
+          <w:sz w:val="18"/>
+          <w:szCs w:val="18"/>
+        </w:rPr>
+        <w:t xml:space="preserve">, Classless Inter-Domain Routing - notazione che esprime una sottorete come indirizzo seguito dal numero di bit di prefisso, ad esempio 192.168.1.0/24.</w:t>
+      </w:r>
+    </w:p>
+  </w:footnote>
+  <w:footnote w:id="23">
+    <w:p>
+      <w:pPr>
+        <w:spacing w:after="40"/>
+        <w:jc w:val="both"/>
+      </w:pPr>
+      <w:r>
+        <w:rPr>
+          <w:rStyle w:val="Rimandonotaapidipagina"/>
+        </w:rPr>
+        <w:footnoteRef/>
+      </w:r>
+      <w:r>
+        <w:rPr>
+          <w:color w:val="595959"/>
+          <w:sz w:val="18"/>
+          <w:szCs w:val="18"/>
+        </w:rPr>
+        <w:t xml:space="preserve"> </w:t>
+      </w:r>
+      <w:r>
+        <w:rPr>
+          <w:i/>
+          <w:color w:val="595959"/>
+          <w:sz w:val="18"/>
+          <w:szCs w:val="18"/>
+        </w:rPr>
+        <w:t xml:space="preserve">NER</w:t>
+      </w:r>
+      <w:r>
+        <w:rPr>
+          <w:color w:val="595959"/>
+          <w:sz w:val="18"/>
+          <w:szCs w:val="18"/>
+        </w:rPr>
+        <w:t xml:space="preserve">, Named Entity Recognition - riconoscimento automatico di entità nominate in un testo, qui usato per individuare i nomi di persona da mascherare.</w:t>
+      </w:r>
+    </w:p>
+  </w:footnote>
+  <w:footnote w:id="24">
+    <w:p>
+      <w:pPr>
+        <w:spacing w:after="40"/>
+        <w:jc w:val="both"/>
+      </w:pPr>
+      <w:r>
+        <w:rPr>
+          <w:rStyle w:val="Rimandonotaapidipagina"/>
+        </w:rPr>
+        <w:footnoteRef/>
+      </w:r>
+      <w:r>
+        <w:rPr>
+          <w:color w:val="595959"/>
+          <w:sz w:val="18"/>
+          <w:szCs w:val="18"/>
+        </w:rPr>
+        <w:t xml:space="preserve"> </w:t>
+      </w:r>
+      <w:r>
+        <w:rPr>
+          <w:i/>
+          <w:color w:val="595959"/>
+          <w:sz w:val="18"/>
+          <w:szCs w:val="18"/>
+        </w:rPr>
+        <w:t xml:space="preserve">PSK</w:t>
+      </w:r>
+      <w:r>
+        <w:rPr>
+          <w:color w:val="595959"/>
+          <w:sz w:val="18"/>
+          <w:szCs w:val="18"/>
+        </w:rPr>
+        <w:t xml:space="preserve">, Pre-Shared Key - chiave condivisa in anticipo fra due estremi di un tunnel VPN, che compare in chiaro nei file di configurazione dei firewall.</w:t>
       </w:r>
     </w:p>
   </w:footnote>

</xml_diff>

<commit_message>
Diario: sezione C.13; sync-context bump schede a 21e11b3
</commit_message>
<xml_diff>
--- a/diario-tecnico-progetto (lettore-doc + skills-repo).docx
+++ b/diario-tecnico-progetto (lettore-doc + skills-repo).docx
@@ -16088,6 +16088,464 @@
       </w:r>
       <w:r>
         <w:t xml:space="preserve"> sono stati aggiunti tre momenti in cui l'agente ricorda da solo di aggiornare il diario: a fine ciclo di ingest, all'apertura di sessione quando il ritardo supera i sette giorni, e a valle di un refactor architetturale. Il debito che questa sezione chiude è esattamente ciò che quei promemoria esistono per prevenire.</w:t>
+      </w:r>
+    </w:p>
+    <w:p>
+      <w:pPr>
+        <w:pStyle w:val="Titolo2"/>
+      </w:pPr>
+      <w:r>
+        <w:t>C.13 Ciclo Cybersec endpoint governance, e la fuga dai nomi dei file (2026-07-28)</w:t>
+      </w:r>
+    </w:p>
+    <w:p>
+      <w:pPr/>
+      <w:r>
+        <w:t>Il quarto ciclo di ingest è nato con un obiettivo dichiarato oltre a quello ordinario: verificare sul campo se le correzioni al routing fatte il giorno prima reggessero su un corpus nuovo. La risposta è sì, ma il ciclo ha scoperto tre difetti che nessuna delle verifiche precedenti aveva intercettato, e uno dei tre era una fuga di dati vera nel repository pubblico.</w:t>
+      </w:r>
+    </w:p>
+    <w:p>
+      <w:pPr>
+        <w:pStyle w:val="Titolo3"/>
+      </w:pPr>
+      <w:r>
+        <w:t>La selezione, e cosa è stato tenuto fuori</w:t>
+      </w:r>
+    </w:p>
+    <w:p>
+      <w:pPr/>
+      <w:r>
+        <w:t xml:space="preserve">Il segmento </w:t>
+      </w:r>
+      <w:r>
+        <w:rPr>
+          <w:i/>
+        </w:rPr>
+        <w:t>Cybersecurity &amp; IT Governance</w:t>
+      </w:r>
+      <w:r>
+        <w:t xml:space="preserve"> della sorgente OneDrive conta quattrocentocinquanta file testuali, dei quali nove erano stati lavorati nel ciclo di luglio. La selezione di questo ciclo prende </w:t>
+      </w:r>
+      <w:r>
+        <w:rPr>
+          <w:rFonts w:ascii="Consolas" w:hAnsi="Consolas"/>
+        </w:rPr>
+        <w:t>_Bitdefender (endpoint security)</w:t>
+      </w:r>
+      <w:r>
+        <w:t xml:space="preserve"> per intero, sei documenti su migrazione da ESET a Bitdefender, protezione LAN ed eccezioni endpoint, e vi aggiunge tre documenti di governance non problematici pescati dal blocco GDPR e ISO27001: la politica PSGSI di sicurezza delle informazioni, un template ISO27001 e un brief su DORA.</w:t>
+      </w:r>
+    </w:p>
+    <w:p>
+      <w:pPr/>
+      <w:r>
+        <w:t xml:space="preserve">Le esclusioni raccontano più delle inclusioni, e sono state fatte leggendo i nomi dei file prima di aprirli. Sono rimasti fuori un accordo di non divulgazione intestato a una persona nominata, due deleghe che portano cognomi nel nome del file, e soprattutto un documento su dati sanitari e donazione riferito a una persona identificabile, che è categoria particolare ai sensi dell'articolo 9 del Regolamento e non ha alcuna collocazione in una tassonomia pubblica di competenze. Sono rimasti fuori anche i report di rischio prodotti da due fornitori sull'infrastruttura reale, con domini e indirizzi IP: pubblicare l'esito di un </w:t>
+      </w:r>
+      <w:r>
+        <w:rPr>
+          <w:i/>
+        </w:rPr>
+        <w:t>vulnerability assessment</w:t>
+      </w:r>
+      <w:r>
+        <w:t xml:space="preserve"> significa divulgare le debolezze di un'organizzazione reale, e la sostituzione con placeholder non rende quel materiale accettabile, perché il problema non è l'identificabilità ma il contenuto. Fuori anche i centoventisei questionari fornitori, che sono dati commerciali di terzi, e la polizza assicurativa post-disaster.</w:t>
+      </w:r>
+    </w:p>
+    <w:p>
+      <w:pPr/>
+      <w:r>
+        <w:t xml:space="preserve">Due file avevano nomi che, staccati dal loro albero di cartelle, perdevano ogni significato: </w:t>
+      </w:r>
+      <w:r>
+        <w:rPr>
+          <w:rFonts w:ascii="Consolas" w:hAnsi="Consolas"/>
+        </w:rPr>
+        <w:t>09092025.docx</w:t>
+      </w:r>
+      <w:r>
+        <w:t xml:space="preserve"> e </w:t>
+      </w:r>
+      <w:r>
+        <w:rPr>
+          <w:rFonts w:ascii="Consolas" w:hAnsi="Consolas"/>
+        </w:rPr>
+        <w:t>primo accesso.docx</w:t>
+      </w:r>
+      <w:r>
+        <w:t xml:space="preserve">. Sono stati prefissati con il tema della sottocartella di origine, perché un nome così diventa una </w:t>
+      </w:r>
+      <w:r>
+        <w:rPr>
+          <w:i/>
+        </w:rPr>
+        <w:t>label</w:t>
+      </w:r>
+      <w:r>
+        <w:t xml:space="preserve"> incomprensibile nel grafo e quindi un'evidenza inutile nella pagina pubblica.</w:t>
+      </w:r>
+    </w:p>
+    <w:p>
+      <w:pPr>
+        <w:pStyle w:val="Titolo3"/>
+      </w:pPr>
+      <w:r>
+        <w:t>Il collaudo del routing</w:t>
+      </w:r>
+    </w:p>
+    <w:p>
+      <w:pPr/>
+      <w:r>
+        <w:t>Il pre-flight introdotto il giorno prima ha riportato nove documenti su nove che passano il filtro sui nomi di graphify: su questo corpus quel filtro non morde, ma la cartella sanitizzata serve comunque per la conversione in Markdown. graphify ha prodotto trentacinque nodi, cinquantatré collegamenti e sette community, con il sistema di gestione della sicurezza delle informazioni come nodo più connesso del grafo, nove archi, e una distribuzione di confidenza del sessantotto per cento estratto contro trentadue per cento inferito.</w:t>
+      </w:r>
+    </w:p>
+    <w:p>
+      <w:pPr/>
+      <w:r>
+        <w:t xml:space="preserve">Il risultato che interessava è che la classificazione automatica ha mandato ventitré evidenze su ventiquattro a </w:t>
+      </w:r>
+      <w:r>
+        <w:rPr>
+          <w:i/>
+        </w:rPr>
+        <w:t>Cybersecurity &amp; IT Governance</w:t>
+      </w:r>
+      <w:r>
+        <w:t xml:space="preserve"> e nessuna a </w:t>
+      </w:r>
+      <w:r>
+        <w:rPr>
+          <w:i/>
+        </w:rPr>
+        <w:t>Quality Certification</w:t>
+      </w:r>
+      <w:r>
+        <w:t>. Lo spostamento di proprietà del perimetro GDPR fatto il giorno prima tiene, e non è stato necessario alcun intervento su quel fronte.</w:t>
+      </w:r>
+    </w:p>
+    <w:p>
+      <w:pPr/>
+      <w:r>
+        <w:t xml:space="preserve">La revisione manuale ha comunque trovato cinque assegnazioni da correggere su ventotto, contro le diciotto su trentaquattro del ciclo precedente. La causa però è diversa, e vale registrarla perché è la prossima da affrontare: token generici come </w:t>
+      </w:r>
+      <w:r>
+        <w:rPr>
+          <w:rFonts w:ascii="Consolas" w:hAnsi="Consolas"/>
+        </w:rPr>
+        <w:t>IP</w:t>
+      </w:r>
+      <w:r>
+        <w:t xml:space="preserve"> e </w:t>
+      </w:r>
+      <w:r>
+        <w:rPr>
+          <w:rFonts w:ascii="Consolas" w:hAnsi="Consolas"/>
+        </w:rPr>
+        <w:t>firewall</w:t>
+      </w:r>
+      <w:r>
+        <w:t xml:space="preserve"> pesano più del contesto, e trascinano verso </w:t>
+      </w:r>
+      <w:r>
+        <w:rPr>
+          <w:i/>
+        </w:rPr>
+        <w:t>Networking Engineering and Security</w:t>
+      </w:r>
+      <w:r>
+        <w:t xml:space="preserve"> nodi che parlano di eccezioni antivirus e di </w:t>
+      </w:r>
+      <w:r>
+        <w:rPr>
+          <w:i/>
+        </w:rPr>
+        <w:t>hardening</w:t>
+      </w:r>
+      <w:r>
+        <w:t xml:space="preserve"> degli endpoint. Il caso più netto è il sistema di gestione della sicurezza delle informazioni finito in </w:t>
+      </w:r>
+      <w:r>
+        <w:rPr>
+          <w:i/>
+        </w:rPr>
+        <w:t>IT Administration and Billing</w:t>
+      </w:r>
+      <w:r>
+        <w:t>, cioè il nodo più connesso dell'intero grafo assegnato alla pagina sbagliata. L'unica assegnazione fuori dalla pagina di sicurezza che è stata confermata è il problema di connessione RDP sulla rete locale, che è davvero troubleshooting di rete.</w:t>
+      </w:r>
+    </w:p>
+    <w:p>
+      <w:pPr>
+        <w:pStyle w:val="Titolo3"/>
+      </w:pPr>
+      <w:r>
+        <w:t>La fuga, e perché il riepilogo non l'aveva vista</w:t>
+      </w:r>
+    </w:p>
+    <w:p>
+      <w:pPr/>
+      <w:r>
+        <w:t xml:space="preserve">L'export ha dichiarato ventotto iniezioni, zero salti, zero file mancanti, e il controllo con </w:t>
+      </w:r>
+      <w:r>
+        <w:rPr>
+          <w:rFonts w:ascii="Consolas" w:hAnsi="Consolas"/>
+        </w:rPr>
+        <w:t>git diff -w --numstat</w:t>
+      </w:r>
+      <w:r>
+        <w:t xml:space="preserve"> ha mostrato solo aggiunte, duecentosessantasette righe su una pagina e dieci sull'altra. Tutti i segnali erano verdi. Cercando però le stringhe sensibili dentro il diff, prima di committare, sono comparse quattordici occorrenze della ragione sociale e una dell'hostname di una postazione.</w:t>
+      </w:r>
+    </w:p>
+    <w:p>
+      <w:pPr/>
+      <w:r>
+        <w:t xml:space="preserve">Il vettore non era il testo delle evidenze, che la catena di anonimizzazione tratta da luglio, ma i </w:t>
+      </w:r>
+      <w:r>
+        <w:rPr>
+          <w:i/>
+        </w:rPr>
+        <w:t>nomi dei file</w:t>
+      </w:r>
+      <w:r>
+        <w:t xml:space="preserve">. Un documento aziendale si chiama per forza di cose "Protezione avanzata (LAN) Intrawelt.docx" oppure "advancedIPscanner eccezione su PC-ALESSIO.docx", e quel nome arrivava nel repository pubblico per due strade indipendenti. La prima è la riga </w:t>
+      </w:r>
+      <w:r>
+        <w:rPr>
+          <w:rFonts w:ascii="Consolas" w:hAnsi="Consolas"/>
+        </w:rPr>
+        <w:t>- **Source**:</w:t>
+      </w:r>
+      <w:r>
+        <w:t xml:space="preserve"> di ogni blocco di evidenza, che </w:t>
+      </w:r>
+      <w:r>
+        <w:rPr>
+          <w:rFonts w:ascii="Consolas" w:hAnsi="Consolas"/>
+        </w:rPr>
+        <w:t>export_to_taxonomy.py</w:t>
+      </w:r>
+      <w:r>
+        <w:t xml:space="preserve"> scriveva verbatim senza farla passare per la funzione di sostituzione, a differenza del label, del titolo e del preview. La seconda è più insidiosa: il preview del corpo erano i primi duecento caratteri del file sanitizzato, e quel file apre con il frontmatter di tracciabilità, che contiene un campo </w:t>
+      </w:r>
+      <w:r>
+        <w:rPr>
+          <w:rFonts w:ascii="Consolas" w:hAnsi="Consolas"/>
+        </w:rPr>
+        <w:t>source_file</w:t>
+      </w:r>
+      <w:r>
+        <w:t xml:space="preserve"> con il nome del documento di partenza. La fuga entrava quindi anche nel corpo, aggirando la mappa dall'interno.</w:t>
+      </w:r>
+    </w:p>
+    <w:p>
+      <w:pPr/>
+      <w:r>
+        <w:t xml:space="preserve">La correzione è distribuita su tre livelli, coerentemente con la difesa in profondità del resto della catena. </w:t>
+      </w:r>
+      <w:r>
+        <w:rPr>
+          <w:rFonts w:ascii="Consolas" w:hAnsi="Consolas"/>
+        </w:rPr>
+        <w:t>enrich_graph.py</w:t>
+      </w:r>
+      <w:r>
+        <w:t xml:space="preserve"> salta il frontmatter prima di costruire il preview, e questo come effetto secondario migliora ogni evidenza futura, perché i duecento caratteri diventano contenuto invece che metadato. </w:t>
+      </w:r>
+      <w:r>
+        <w:rPr>
+          <w:rFonts w:ascii="Consolas" w:hAnsi="Consolas"/>
+        </w:rPr>
+        <w:t>export_to_taxonomy.py</w:t>
+      </w:r>
+      <w:r>
+        <w:t xml:space="preserve"> fa passare il nome del file per la sostituzione come qualsiasi altro testo. E </w:t>
+      </w:r>
+      <w:r>
+        <w:rPr>
+          <w:rFonts w:ascii="Consolas" w:hAnsi="Consolas"/>
+        </w:rPr>
+        <w:t>sanitize_taxonomy_diff.py</w:t>
+      </w:r>
+      <w:r>
+        <w:t xml:space="preserve">, che ispezionava soltanto il label, ispeziona ora anche il nome file e il preview: su questi due campi però </w:t>
+      </w:r>
+      <w:r>
+        <w:rPr>
+          <w:i/>
+        </w:rPr>
+        <w:t>scruba</w:t>
+      </w:r>
+      <w:r>
+        <w:t>, sostituendo il residuo con un marcatore e tenendone il conto nel report, invece di scartare l'evidenza. La distinzione è deliberata. Un label che contiene un residuo, una volta scrubato, rischia di non voler dire più nulla, e allora tanto vale scartare la voce; una ragione sociale nel nome di un documento non rende l'evidenza inutile, la rende soltanto non pubblicabile in quella forma. Con lo scarto si sarebbero perse venti evidenze buone.</w:t>
+      </w:r>
+    </w:p>
+    <w:p>
+      <w:pPr/>
+      <w:r>
+        <w:t>Va detto che il difetto era preesistente e non nasce con questo ciclo: le evidenze pubblicate il sedici luglio hanno tutte un preview che comincia dal frontmatter. Per fortuna quei nomi di file non contenevano ragione sociale, quindi non c'è stata divulgazione, ma la qualità di quelle voci era già compromessa.</w:t>
+      </w:r>
+    </w:p>
+    <w:p>
+      <w:pPr/>
+      <w:r>
+        <w:t>La lezione di metodo conta più delle tre patch. Il riepilogo di uno script che dichiara successo non è una verifica di riservatezza, e nemmeno il conteggio delle righe aggiunte: dicono che l'operazione ha funzionato, non che ciò che ha scritto sia pubblicabile. La verifica che ha funzionato è stata cercare esplicitamente nel diff i cognomi noti, il dominio aziendale, la ragione sociale nuda, gli indirizzi interni e gli hostname del parco macchine, e in parallelo contare quante sostituzioni fossero state effettivamente applicate, perché zero mascherature su un corpus aziendale è un dato più sospetto di molte. Il momento giusto per farlo è con l'</w:t>
+      </w:r>
+      <w:r>
+        <w:rPr>
+          <w:rFonts w:ascii="Consolas" w:hAnsi="Consolas"/>
+        </w:rPr>
+        <w:t>--apply</w:t>
+      </w:r>
+      <w:r>
+        <w:t xml:space="preserve"> già eseguito e nulla ancora committato, cioè nella finestra in cui un </w:t>
+      </w:r>
+      <w:r>
+        <w:rPr>
+          <w:rFonts w:ascii="Consolas" w:hAnsi="Consolas"/>
+        </w:rPr>
+        <w:t>git checkout</w:t>
+      </w:r>
+      <w:r>
+        <w:t xml:space="preserve"> annulla tutto. Questo passo è ora scritto fra i controlli obbligatori del progetto.</w:t>
+      </w:r>
+    </w:p>
+    <w:p>
+      <w:pPr>
+        <w:pStyle w:val="Titolo3"/>
+      </w:pPr>
+      <w:r>
+        <w:t>Due falsi positivi che danneggiavano l'evidenza</w:t>
+      </w:r>
+    </w:p>
+    <w:p>
+      <w:pPr/>
+      <w:r>
+        <w:t xml:space="preserve">Gli altri due difetti riguardano l'estrazione delle entità, e hanno in comune una caratteristica interessante: non erano fughe, erano </w:t>
+      </w:r>
+      <w:r>
+        <w:rPr>
+          <w:i/>
+        </w:rPr>
+        <w:t>sovra-protezioni</w:t>
+      </w:r>
+      <w:r>
+        <w:t xml:space="preserve"> che rovinavano il risultato. Il primo è che la parola </w:t>
+      </w:r>
+      <w:r>
+        <w:rPr>
+          <w:rFonts w:ascii="Consolas" w:hAnsi="Consolas"/>
+        </w:rPr>
+        <w:t>WINDOWS</w:t>
+      </w:r>
+      <w:r>
+        <w:t xml:space="preserve"> veniva riconosciuta come hostname e mascherata, in un corpus di sicurezza degli endpoint dove quella parola è dappertutto. La causa non era una regola mancante, ed è questo il punto interessante: </w:t>
+      </w:r>
+      <w:r>
+        <w:rPr>
+          <w:rFonts w:ascii="Consolas" w:hAnsi="Consolas"/>
+        </w:rPr>
+        <w:t>Windows</w:t>
+      </w:r>
+      <w:r>
+        <w:t xml:space="preserve"> era già presente nella lista dei marchi da ignorare, ma il confronto su quel percorso era sensibile alle maiuscole, mentre le due espressioni regolari che riconoscono gli hostname per costruzione catturano solo testo maiuscolo. Il filtro esisteva e non era mai scattato. Il confronto avviene ora su una versione minuscola precalcolata della lista, che protegge per la stessa ragione anche </w:t>
+      </w:r>
+      <w:r>
+        <w:rPr>
+          <w:rFonts w:ascii="Consolas" w:hAnsi="Consolas"/>
+        </w:rPr>
+        <w:t>LINUX</w:t>
+      </w:r>
+      <w:r>
+        <w:t xml:space="preserve">, </w:t>
+      </w:r>
+      <w:r>
+        <w:rPr>
+          <w:rFonts w:ascii="Consolas" w:hAnsi="Consolas"/>
+        </w:rPr>
+        <w:t>UBUNTU</w:t>
+      </w:r>
+      <w:r>
+        <w:t xml:space="preserve"> e simili.</w:t>
+      </w:r>
+    </w:p>
+    <w:p>
+      <w:pPr/>
+      <w:r>
+        <w:t>Il secondo è che il riconoscitore di entità nominate produceva porzioni di testo che attraversavano le interruzioni di riga, e così una voce della mappa partiva da "Bitdefender Gravityzone" e proseguiva per tre righe inglobando residui di un template. Mascherare quella stringa avrebbe significato nascondere il prodotto centrale del corpus, cioè esattamente la competenza che la pagina pubblica deve dichiarare. Il vincolo aggiunto è banale nella forma e solido nella sostanza: un nome di persona non attraversa un'interruzione di paragrafo. Alla lista dei marchi sono stati aggiunti i fornitori di sicurezza, che nel dominio di questo progetto ricorrono continuamente e sono l'ultima cosa da offuscare.</w:t>
+      </w:r>
+    </w:p>
+    <w:p>
+      <w:pPr>
+        <w:pStyle w:val="Titolo3"/>
+      </w:pPr>
+      <w:r>
+        <w:t>Il limite che nessuna correzione lessicale supera</w:t>
+      </w:r>
+    </w:p>
+    <w:p>
+      <w:pPr/>
+      <w:r>
+        <w:t xml:space="preserve">Un nodo del grafo è rimasto non classificato con punteggio esattamente zero: la politica PSGSI di sicurezza delle informazioni, che è il documento di governance più importante dei nove selezionati. Il motivo non è una soglia troppo alta né una parola chiave mancante. Il corpus è in italiano e il vocabolario della tassonomia è in inglese, quindi una etichetta come </w:t>
+      </w:r>
+      <w:r>
+        <w:rPr>
+          <w:i/>
+        </w:rPr>
+        <w:t>Politica Sicurezza Informazioni</w:t>
+      </w:r>
+      <w:r>
+        <w:t xml:space="preserve"> non ha un solo token in comune con </w:t>
+      </w:r>
+      <w:r>
+        <w:rPr>
+          <w:rFonts w:ascii="Consolas" w:hAnsi="Consolas"/>
+        </w:rPr>
+        <w:t>security</w:t>
+      </w:r>
+      <w:r>
+        <w:t xml:space="preserve">, </w:t>
+      </w:r>
+      <w:r>
+        <w:rPr>
+          <w:rFonts w:ascii="Consolas" w:hAnsi="Consolas"/>
+        </w:rPr>
+        <w:t>policy</w:t>
+      </w:r>
+      <w:r>
+        <w:t xml:space="preserve"> o </w:t>
+      </w:r>
+      <w:r>
+        <w:rPr>
+          <w:rFonts w:ascii="Consolas" w:hAnsi="Consolas"/>
+        </w:rPr>
+        <w:t>compliance</w:t>
+      </w:r>
+      <w:r>
+        <w:t xml:space="preserve">, e prende zero a prescindere da quanto sia pertinente. È lo stesso limite di fondo del misrouting risolto il giorno prima, il match puramente lessicale, ma in una forma che curare il vocabolario delle pagine non tocca nemmeno. Finché la funzione di punteggio resta un rapporto di token condivisi, questa classe di casi va recuperata a mano in revisione, e l'unica soluzione strutturale è il passaggio a una rappresentazione semantica, cioè la voce sugli </w:t>
+      </w:r>
+      <w:r>
+        <w:rPr>
+          <w:i/>
+        </w:rPr>
+        <w:t>embedding</w:t>
+      </w:r>
+      <w:r>
+        <w:t xml:space="preserve"> che era in lista fra le estensioni possibili e che questo ciclo promuove da idea a necessità.</w:t>
+      </w:r>
+    </w:p>
+    <w:p>
+      <w:pPr>
+        <w:pStyle w:val="Titolo3"/>
+      </w:pPr>
+      <w:r>
+        <w:t>Chiusura</w:t>
+      </w:r>
+    </w:p>
+    <w:p>
+      <w:pPr/>
+      <w:r>
+        <w:t>Ventotto evidenze iniettate su due pagine Capability, ventisette sulla sicurezza e una sulla rete, solo aggiunte, build del sito verde. Lo stato di ingest è stato aggiornato sulla sola sottocartella Bitdefender, non su quella di governance: di quest'ultima sono stati lavorati tre documenti su tredici, e registrarla per intero l'avrebbe fatta sparire dai riepiloghi futuri con delta zero, nascondendo i dieci non lavorati. Lo stato serve a sapere cosa resta da fare, e va tenuto onesto anche quando questo significa vedere una sottocartella ricomparire a ogni apertura di sessione.</w:t>
       </w:r>
     </w:p>
     <w:p>

</xml_diff>

<commit_message>
Diario C.14, bump schede a 9594d44, ripristino LF in export
</commit_message>
<xml_diff>
--- a/diario-tecnico-progetto (lettore-doc + skills-repo).docx
+++ b/diario-tecnico-progetto (lettore-doc + skills-repo).docx
@@ -16546,6 +16546,210 @@
       <w:pPr/>
       <w:r>
         <w:t>Ventotto evidenze iniettate su due pagine Capability, ventisette sulla sicurezza e una sulla rete, solo aggiunte, build del sito verde. Lo stato di ingest è stato aggiornato sulla sola sottocartella Bitdefender, non su quella di governance: di quest'ultima sono stati lavorati tre documenti su tredici, e registrarla per intero l'avrebbe fatta sparire dai riepiloghi futuri con delta zero, nascondendo i dieci non lavorati. Lo stato serve a sapere cosa resta da fare, e va tenuto onesto anche quando questo significa vedere una sottocartella ricomparire a ogni apertura di sessione.</w:t>
+      </w:r>
+    </w:p>
+    <w:p>
+      <w:pPr>
+        <w:pStyle w:val="Titolo2"/>
+      </w:pPr>
+      <w:r>
+        <w:t>C.14 Riparare evidenze già pubblicate: audit, refresh e preview ancorato (2026-07-28)</w:t>
+      </w:r>
+    </w:p>
+    <w:p>
+      <w:pPr/>
+      <w:r>
+        <w:t>Questa sezione nasce da una domanda apparentemente semplice, se si potesse anonimizzare a posteriori la fuga scoperta nel ciclo precedente. La risposta è che non ce n'era bisogno, ma verificarlo ha aperto un capitolo che il sistema non sapeva ancora affrontare: come si corregge un'evidenza già pubblicata.</w:t>
+      </w:r>
+    </w:p>
+    <w:p>
+      <w:pPr>
+        <w:pStyle w:val="Titolo3"/>
+      </w:pPr>
+      <w:r>
+        <w:t>L'audit, e perché va fatto anche sulla storia</w:t>
+      </w:r>
+    </w:p>
+    <w:p>
+      <w:pPr/>
+      <w:r>
+        <w:t>La fuga del ciclo Cybersec endpoint era stata annullata con un ripristino prima di qualunque commit, quindi non aveva mai raggiunto il repository remoto. Fidarsi di questo ricordo però non basta, per due motivi. Il difetto che l'aveva causata era preesistente, quindi andava controllato tutto il pubblicato e non soltanto l'ultimo ciclo. E soprattutto la storia di un repository pubblico è pubblica quanto i suoi file: se una fuga fosse stata committata e poi corretta in un commit successivo, resterebbe perfettamente leggibile nei commit precedenti, e un ripristino del file corrente non la toglierebbe.</w:t>
+      </w:r>
+    </w:p>
+    <w:p>
+      <w:pPr/>
+      <w:r>
+        <w:t>L'audit è stato quindi doppio, sull'albero di lavoro e su tutti i venti commit della storia, cercando cognomi, indirizzi di posta, indirizzi interni, hostname del parco macchine, domini aziendali, nomi di fornitori e indirizzi di sede. Il risultato è che nessuna di quelle categorie compare mai, in nessun commit. La catena di anonimizzazione e il gate residue avevano fatto il loro lavoro, e l'unico buco, quello dei nomi dei file, era stato intercettato prima di committare.</w:t>
+      </w:r>
+    </w:p>
+    <w:p>
+      <w:pPr>
+        <w:pStyle w:val="Titolo3"/>
+      </w:pPr>
+      <w:r>
+        <w:t>Un'incoerenza di policy scambiata per una fuga</w:t>
+      </w:r>
+    </w:p>
+    <w:p>
+      <w:pPr/>
+      <w:r>
+        <w:t>L'unica stringa presente era la ragione sociale nuda, e l'analisi del contesto ha mostrato che non era una perdita ma un'incoerenza. La pagina di presentazione del sito dichiara volutamente, in testo scritto a mano, il ruolo di IT Manager presso l'azienda, con proprietà del budget e della roadmap; la sezione delle tecnologie di una pagina Capability elenca i provider di hosting per nome. Sono il curriculum, non una divulgazione involontaria. Nello stesso repository però il gate residue trattava quel nome come materiale da scartare, e nel ciclo precedente ne aveva scrubato quattordici occorrenze e scartato due evidenze intere.</w:t>
+      </w:r>
+    </w:p>
+    <w:p>
+      <w:pPr/>
+      <w:r>
+        <w:t>Mascherare un nome in un punto mentre la pagina di presentazione lo dichiara non protegge nulla e costa evidenze buone. La regola è stata rimossa, tenendo invece tutto ciò che descrive l'infrastruttura o identifica una persona: il dominio, gli indirizzi di posta, gli indirizzi interni, gli hostname, i fornitori e le sedi fisiche. La distinzione utile non è fra pubblico e privato in astratto, ma fra ciò che il proprietario del profilo ha scelto di dichiarare e ciò che descrive un sistema di terzi.</w:t>
+      </w:r>
+    </w:p>
+    <w:p>
+      <w:pPr>
+        <w:pStyle w:val="Titolo3"/>
+      </w:pPr>
+      <w:r>
+        <w:t>Il difetto vero: quarantaquattro evidenze identiche</w:t>
+      </w:r>
+    </w:p>
+    <w:p>
+      <w:pPr/>
+      <w:r>
+        <w:t>L'audit ha però trovato un problema che nessun controllo di riservatezza avrebbe segnalato, perché non è una fuga. Quarantaquattro blocchi di evidenza distribuiti su nove pagine, iniettati dal ciclo infrastrutturale di luglio, avevano tutti il medesimo testo: gli stessi duecento caratteri, cioè il commento di conversione più il titolo del documento più il primo sottotitolo, senza mai arrivare al contenuto. Quarantaquattro voci che dicono la stessa cosa e non informano su nulla, visibili pubblicamente.</w:t>
+      </w:r>
+    </w:p>
+    <w:p>
+      <w:pPr/>
+      <w:r>
+        <w:t>La riparazione ha richiesto tre interventi, e il primo tentativo è stato insufficiente. La correzione fatta il giorno prima toglieva il frontmatter delle note di tracciabilità, ma quei file provengono dal convertitore di graphify e aprono con un commento in stile HTML, quindi il taglio non li toccava affatto: la funzione riconosce ora entrambi i formati, perché esistono due convertitori, e scarta anche le intestazioni iniziali.</w:t>
+      </w:r>
+    </w:p>
+    <w:p>
+      <w:pPr/>
+      <w:r>
+        <w:t xml:space="preserve">Il punto sostanziale era però un altro, e sarebbe rimasto anche togliendo correttamente l'intestazione. Il testo di anteprima veniva costruito </w:t>
+      </w:r>
+      <w:r>
+        <w:rPr>
+          <w:i/>
+        </w:rPr>
+        <w:t>sul file</w:t>
+      </w:r>
+      <w:r>
+        <w:t xml:space="preserve"> e non </w:t>
+      </w:r>
+      <w:r>
+        <w:rPr>
+          <w:i/>
+        </w:rPr>
+        <w:t>sul nodo</w:t>
+      </w:r>
+      <w:r>
+        <w:t>, quindi tutte le evidenze estratte dallo stesso documento erano identiche per costruzione. I nodi prodotti da graphify non portano un riferimento di posizione, il campo apposito è vuoto, quindi l'ancoraggio va ricostruito: il documento viene spezzato in paragrafi e si sceglie quello che contiene più termini distintivi dell'etichetta del nodo, ripiegando sull'inizio del documento quando nessun paragrafo aggancia. La misura sul corpus dice che l'aggancio sull'etichetta intera riesce nell'undici per cento dei casi e quello sui singoli termini nell'ottantasette, e il risultato sono ottantasette anteprime distinte su centoventiquattro nodi, contro una sola per documento.</w:t>
+      </w:r>
+    </w:p>
+    <w:p>
+      <w:pPr>
+        <w:pStyle w:val="Titolo3"/>
+      </w:pPr>
+      <w:r>
+        <w:t>La modalità che mancava</w:t>
+      </w:r>
+    </w:p>
+    <w:p>
+      <w:pPr/>
+      <w:r>
+        <w:t xml:space="preserve">Restava un ostacolo strutturale. L'iniezione delle evidenze è idempotente per identificatore stabile, cioè uno hash del nodo e della Capability scritto in un commento invisibile, e questo garantisce che rilanciare l'export non duplichi nulla. Lo stesso meccanismo però rendeva impossibile </w:t>
+      </w:r>
+      <w:r>
+        <w:rPr>
+          <w:i/>
+        </w:rPr>
+        <w:t>correggere</w:t>
+      </w:r>
+      <w:r>
+        <w:t xml:space="preserve"> un'evidenza già pubblicata: l'export la riconosceva come presente e la saltava, e l'unica via sarebbe stata riscrivere a mano le sezioni delle evidenze, cosa che le regole operative del progetto vietano esplicitamente perché quelle sezioni sono di competenza esclusiva dello script.</w:t>
+      </w:r>
+    </w:p>
+    <w:p>
+      <w:pPr/>
+      <w:r>
+        <w:t>È stata quindi aggiunta una modalità di riscrittura, che sostituisce in blocco l'evidenza identificata, delimitandola risalendo dall'ancora invisibile all'intestazione di terzo livello che la precede e scendendo fino all'intestazione successiva. Sul primo uso reale ha riscritto cinquantasei evidenze e ne ha aggiunte due, senza lasciare blocchi orfani, perché la sovrapposizione fra gli identificatori del nuovo passaggio e quelli già pubblicati era di cinquantasei su cinquantotto.</w:t>
+      </w:r>
+    </w:p>
+    <w:p>
+      <w:pPr>
+        <w:pStyle w:val="Titolo3"/>
+      </w:pPr>
+      <w:r>
+        <w:t>Il prezzo di un'anteprima migliore</w:t>
+      </w:r>
+    </w:p>
+    <w:p>
+      <w:pPr/>
+      <w:r>
+        <w:t>C'è una conseguenza di questo miglioramento che vale enunciare come principio, perché non era ovvia prima di vederla. Finché l'anteprima erano i primi caratteri del file, cioè metadati e titoli, il gate di sanitizzazione lavorava quasi a vuoto: non c'era quasi nulla di sensibile da intercettare. Nel momento in cui l'anteprima diventa il paragrafo pertinente, il testo pubblicato è contenuto reale preso dal centro dei documenti, e i residui arrivano davvero. Sul solo ciclo infrastrutturale il gate ne ha rimossi sei, e ha reso necessario allargare il riconoscimento di un fornitore, che cercava le due parole separate da uno spazio e mancava le forme reali con trattino e con underscore, emerse solo ora.</w:t>
+      </w:r>
+    </w:p>
+    <w:p>
+      <w:pPr/>
+      <w:r>
+        <w:t>Ogni miglioramento della qualità dell'anteprima è quindi anche un ampliamento della superficie da sanitizzare, e va accompagnato da una rilettura dei pattern residui invece che dato per gratuito. Una scelta esplicita in questa direzione: nel testo pubblicato sopravvivono frammenti di indirizzo a tre ottetti, e non è stata aggiunta una regola perché un pattern così cattura i numeri di versione, che in un corpus tecnico sono ovunque, e renderebbe il gate inutilizzabile per falsi positivi; un ottetto parziale senza contesto di rete non identifica un host.</w:t>
+      </w:r>
+    </w:p>
+    <w:p>
+      <w:pPr>
+        <w:pStyle w:val="Titolo3"/>
+      </w:pPr>
+      <w:r>
+        <w:t>Controlli che cambiano forma</w:t>
+      </w:r>
+    </w:p>
+    <w:p>
+      <w:pPr/>
+      <w:r>
+        <w:t>La riscrittura ha reso obsoleto un controllo che era considerato affidabile. Il conteggio delle righe modificate doveva mostrare solo aggiunte, e una cancellazione era un segnale di allarme; in modalità di riscrittura le cancellazioni sono invece legittime e attese, perché il vecchio blocco viene sostituito. Al suo posto valgono due verifiche diverse. Il conteggio degli identificatori di evidenza prima e dopo, che deve restare costante a meno delle aggiunte volute, perché un calo significa che la delimitazione del blocco ha divorato quello adiacente. E la presenza delle quattro intestazioni di contratto in ogni pagina toccata, perché sono il presupposto su cui l'export si appoggia e una riscrittura che ne mangia una romperebbe silenziosamente tutte le iniezioni future. Sul primo uso reale gli identificatori sono passati da duecentotrentacinque a duecentotrentanove, con quattro aggiunte attese e nessuna perdita, e tutte e undici le pagine hanno conservato la struttura.</w:t>
+      </w:r>
+    </w:p>
+    <w:p>
+      <w:pPr>
+        <w:pStyle w:val="Titolo3"/>
+      </w:pPr>
+      <w:r>
+        <w:t>Un'inefficienza corretta di passaggio</w:t>
+      </w:r>
+    </w:p>
+    <w:p>
+      <w:pPr/>
+      <w:r>
+        <w:t>L'attesa dell'estrazione ha reso visibile un difetto di costo. L'arricchimento del grafo eseguiva l'estrazione delle entità, che gira su tutto il testo di un documento, una volta per ogni nodo invece di una volta per file: un documento citato da cinquanta nodi veniva riletto e rianalizzato dal modello statistico cinquanta volte. Sul ciclo infrastrutturale, duecentotré nodi su una ventina di documenti, questo significava minuti di attesa dove ne bastavano secondi. Una cache per file, corretta perché il risultato dipende dal documento e non dal nodo, ha riportato la riesecuzione sul ciclo di endpoint da minuti a tre secondi. L'aggregazione a valle non cambia, perché ogni nodo continua a contribuire una volta al conteggio delle entità.</w:t>
+      </w:r>
+    </w:p>
+    <w:p>
+      <w:pPr>
+        <w:pStyle w:val="Titolo3"/>
+      </w:pPr>
+      <w:r>
+        <w:t>Chiusura</w:t>
+      </w:r>
+    </w:p>
+    <w:p>
+      <w:pPr/>
+      <w:r>
+        <w:t xml:space="preserve">Undici pagine aggiornate, ottantaquattro evidenze fra riscritte e aggiunte, duecentotrentanove identificatori totali, costruzione del sito verde, e le tre verifiche di riservatezza pulite: sul diff sanitizzato, sul diff reale del repository pubblico prima del commit, e sulla struttura. Commit del repository pubblico </w:t>
+      </w:r>
+      <w:r>
+        <w:rPr>
+          <w:rFonts w:ascii="Consolas" w:hAnsi="Consolas"/>
+        </w:rPr>
+        <w:t>502efe5</w:t>
+      </w:r>
+      <w:r>
+        <w:t>.</w:t>
+      </w:r>
+    </w:p>
+    <w:p>
+      <w:pPr/>
+      <w:r>
+        <w:t>La lezione che questa sessione aggiunge alle precedenti è che un sistema che pubblica ha bisogno non solo di controlli in avanti, ma anche di una via per tornare indietro su ciò che ha già pubblicato. L'idempotenza protegge dai duplicati e insieme immobilizza gli errori: senza una modalità di riscrittura, ogni difetto della pipeline diventava permanente nel prodotto pubblico, con la sola alternativa di un intervento manuale che le regole vietano per ragioni giuste. La capacità di correggere retroattivamente non è un accessorio, è parte del contratto di affidabilità di una pipeline che scrive verso l'esterno.</w:t>
       </w:r>
     </w:p>
     <w:p>

</xml_diff>

<commit_message>
Diario: sezione C.15 su rimozione, gate domini e misura sui corpora
</commit_message>
<xml_diff>
--- a/diario-tecnico-progetto (lettore-doc + skills-repo).docx
+++ b/diario-tecnico-progetto (lettore-doc + skills-repo).docx
@@ -16750,6 +16750,238 @@
       <w:pPr/>
       <w:r>
         <w:t>La lezione che questa sessione aggiunge alle precedenti è che un sistema che pubblica ha bisogno non solo di controlli in avanti, ma anche di una via per tornare indietro su ciò che ha già pubblicato. L'idempotenza protegge dai duplicati e insieme immobilizza gli errori: senza una modalità di riscrittura, ogni difetto della pipeline diventava permanente nel prodotto pubblico, con la sola alternativa di un intervento manuale che le regole vietano per ragioni giuste. La capacità di correggere retroattivamente non è un accessorio, è parte del contratto di affidabilità di una pipeline che scrive verso l'esterno.</w:t>
+      </w:r>
+    </w:p>
+    <w:p>
+      <w:pPr>
+        <w:pStyle w:val="Titolo2"/>
+      </w:pPr>
+      <w:r>
+        <w:t>C.15 Togliere ciò che è già pubblicato, e misurare le regole invece di crederci (2026-07-29)</w:t>
+      </w:r>
+    </w:p>
+    <w:p>
+      <w:pPr/>
+      <w:r>
+        <w:t>La sezione precedente si chiudeva dicendo che una pipeline che scrive verso l'esterno ha bisogno di una via per tornare indietro su ciò che ha già pubblicato, e aveva aggiunto la modalità di riscrittura. Questa sessione affronta il pezzo che mancava, cioè la rimozione, e nel farlo tocca altri tre punti rimasti in coda. Il filo che li unisce non era previsto: in tre casi su quattro la misura sul corpus reale ha corretto la soluzione che sembrava giusta a ragionamento.</w:t>
+      </w:r>
+    </w:p>
+    <w:p>
+      <w:pPr>
+        <w:pStyle w:val="Titolo3"/>
+      </w:pPr>
+      <w:r>
+        <w:t>Perché riscrivere non basta a spostare un nodo</w:t>
+      </w:r>
+    </w:p>
+    <w:p>
+      <w:pPr/>
+      <w:r>
+        <w:t xml:space="preserve">L'identificatore stabile di un'evidenza è uno hash del nodo e della Capability di destinazione. Questa scelta ha un effetto collaterale che si vede solo quando si prova a riclassificare: se un nodo cambia pagina, l'identificatore cambia con lui. La modalità di riscrittura non riconosce più quello vecchio, perché per lei non esiste, quindi scrive il blocco nuovo sulla pagina giusta e lascia il vecchio dove era. Il risultato non è un errore visibile ma una </w:t>
+      </w:r>
+      <w:r>
+        <w:rPr>
+          <w:i/>
+        </w:rPr>
+        <w:t>evidenza duplicata su due pagine</w:t>
+      </w:r>
+      <w:r>
+        <w:t>, di cui una sbagliata.</w:t>
+      </w:r>
+    </w:p>
+    <w:p>
+      <w:pPr/>
+      <w:r>
+        <w:t>Il difetto si è manifestato in una prova a vuoto che riportava cinque iniezioni pianificate e venticinque già presenti, dove i cinque erano nodi mal instradati che avevano preso un identificatore nuovo. Nulla in quel riepilogo diceva che esistevano cinque blocchi orfani, e nemmeno il conteggio delle righe modificate lo avrebbe detto, perché non c'è nessuna riga da modificare. Finché la rimozione non esisteva, nessun cambio della funzione di punteggio poteva essere applicato allo storico: era il vero prerequisito, non una comodità.</w:t>
+      </w:r>
+    </w:p>
+    <w:p>
+      <w:pPr>
+        <w:pStyle w:val="Titolo3"/>
+      </w:pPr>
+      <w:r>
+        <w:t>Il punto delicato è cosa si può dichiarare obsoleto</w:t>
+      </w:r>
+    </w:p>
+    <w:p>
+      <w:pPr/>
+      <w:r>
+        <w:t>L'implementazione ovvia sarebbe confrontare gli identificatori presenti nel repository pubblico con quelli attesi dal diff corrente, e rimuovere la differenza. Sarebbe distruttiva: cancellerebbe le evidenze di tutti i cicli precedenti, i cui nodi non compaiono in questo diff semplicemente perché venivano da un altro corpus. L'assenza dal diff non è un giudizio, è ignoranza.</w:t>
+      </w:r>
+    </w:p>
+    <w:p>
+      <w:pPr/>
+      <w:r>
+        <w:t xml:space="preserve">Un collocamento si può dichiarare obsoleto solo per un nodo che il diff corrente </w:t>
+      </w:r>
+      <w:r>
+        <w:rPr>
+          <w:i/>
+        </w:rPr>
+        <w:t>conosce</w:t>
+      </w:r>
+      <w:r>
+        <w:t xml:space="preserve">, e quindi per cui è in grado di dire dove va. Il diff porta questa informazione in due insiemi distinti: i nodi con una destinazione, che sono i fit, e i nodi conosciuti a qualsiasi titolo, che comprendono anche i non classificati e quelli raccolti nelle proposte di nuova Capability. La ricerca è poi </w:t>
+      </w:r>
+      <w:r>
+        <w:rPr>
+          <w:i/>
+        </w:rPr>
+        <w:t>per costruzione</w:t>
+      </w:r>
+      <w:r>
+        <w:t xml:space="preserve"> e non per confronto: per ogni nodo conosciuto e per ogni pagina candidata si ricalcola l'identificatore che quel nodo avrebbe su quella pagina e lo si cerca fra le ancore effettivamente presenti. Costa uno hash per coppia, qualche migliaio su un ciclo tipico, e ha il vantaggio di non richiedere alcun registro di cosa è stato pubblicato: l'identificatore è il registro.</w:t>
+      </w:r>
+    </w:p>
+    <w:p>
+      <w:pPr/>
+      <w:r>
+        <w:t>Le due ragioni di obsolescenza restano distinte perché hanno rischi diversi. Un nodo che il diff colloca altrove è un caso chiuso, e la rimozione è sicura. Un nodo che il diff non colloca da nessuna parte, perché è sceso sotto soglia, è un caso aperto: una variazione di soglia cancellerebbe evidenze valide. Hanno quindi due flag separati, e nessuno dei due è attivo per default.</w:t>
+      </w:r>
+    </w:p>
+    <w:p>
+      <w:pPr/>
+      <w:r>
+        <w:t>La ricerca invece gira sempre, anche a vuoto e senza flag, perché il suo valore primo è diagnostico. Un'evidenza duplicata su due pagine è invisibile sia nel riepilogo delle iniezioni sia nel conteggio delle righe: si vede solo confrontando gli identificatori, e se il confronto richiede di ricordarsi di chiederlo, non verrà fatto proprio nelle sessioni in cui servirebbe.</w:t>
+      </w:r>
+    </w:p>
+    <w:p>
+      <w:pPr>
+        <w:pStyle w:val="Titolo3"/>
+      </w:pPr>
+      <w:r>
+        <w:t>La prova, e cosa dice il repository reale</w:t>
+      </w:r>
+    </w:p>
+    <w:p>
+      <w:pPr/>
+      <w:r>
+        <w:t>La verifica è stata fatta su un repository sintetico costruito per riprodurre la sequenza esatta: un primo ciclo che pubblica due nodi su una pagina, un secondo che sposta il primo nodo su un'altra pagina e fa scendere il secondo sotto soglia. Senza flag il riepilogo elenca correttamente uno spostato e uno non più previsto e non tocca nulla; con il flag degli spostati il blocco orfano scompare dalla pagina vecchia e resta solo quello nuovo; aggiungendo il secondo flag la pagina si svuota e torna al testo segnaposto iniziale, con le quattro intestazioni di contratto intatte. Verificato anche il caso che conta di più, cioè che un diff i cui nodi sono estranei alle pagine pubblicate non rimuova nulla nemmeno con entrambi i flag attivi.</w:t>
+      </w:r>
+    </w:p>
+    <w:p>
+      <w:pPr/>
+      <w:r>
+        <w:t>Sul repository pubblico reale la passata riporta zero collocamenti obsoleti su trenta evidenze coerenti. È la conferma che non c'è debito pregresso, e insieme la prova che la ricerca non produce falsi positivi su un corpus vero.</w:t>
+      </w:r>
+    </w:p>
+    <w:p>
+      <w:pPr>
+        <w:pStyle w:val="Titolo3"/>
+      </w:pPr>
+      <w:r>
+        <w:t>Un dominio di terzi che nessuno strato fermava</w:t>
+      </w:r>
+    </w:p>
+    <w:p>
+      <w:pPr/>
+      <w:r>
+        <w:t>Il secondo punto in coda riguardava la riservatezza e non la qualità. Il gate dei residui copriva il dominio aziendale ma non un dominio di terzi arbitrario, e il caso che l'aveva fatto notare, il nodo che citava il dominio di un'azienda cliente, non era stato pubblicato solo perché la classificazione gli aveva dato punteggio zero. Non era un gate che aveva funzionato, era un caso fortunato.</w:t>
+      </w:r>
+    </w:p>
+    <w:p>
+      <w:pPr/>
+      <w:r>
+        <w:t>La verifica degli strati a monte ha confermato che il buco era reale e non teorico. La mappa di anonimizzazione registra cinque categorie, azienda, nome proprio, indirizzo di posta, indirizzo di rete e hostname, e nessuna di esse è il nome di dominio; la categoria degli indirizzi web viene estratta ma non entra nella mappa; e nessuna delle regole che potrebbero pescare un dominio lo fa davvero, perché una vuole la chiocciola, un'altra un prefisso infrastrutturale, la terza il maiuscolo con trattino. Un dominio nudo minuscolo attraversava indenne tutti gli strati.</w:t>
+      </w:r>
+    </w:p>
+    <w:p>
+      <w:pPr/>
+      <w:r>
+        <w:t xml:space="preserve">La regola nuova riconosce un nome di dominio registrabile e ha una lista di eccezioni per i domini che su una pagina pubblica di tassonomia sono legittimi e attesi, cioè i fornitori tecnologici citati come tecnologia, le fonti normative che i documenti di compliance nominano, e i </w:t>
+      </w:r>
+      <w:r>
+        <w:rPr>
+          <w:i/>
+        </w:rPr>
+        <w:t>namespace</w:t>
+      </w:r>
+      <w:r>
+        <w:t xml:space="preserve"> di codice che hanno la forma sintattica di un dominio e senza eccezione esplicita verrebbero scambiati per tali. La lista dei suffissi</w:t>
+      </w:r>
+      <w:r>
+        <w:rPr>
+          <w:rStyle w:val="Rimandonotaapidipagina"/>
+        </w:rPr>
+        <w:footnoteReference w:id="25"/>
+      </w:r>
+      <w:r>
+        <w:t xml:space="preserve"> è volutamente corta, perché ogni suffisso in più allarga i falsi positivi su testo tecnico.</w:t>
+      </w:r>
+    </w:p>
+    <w:p>
+      <w:pPr/>
+      <w:r>
+        <w:t>Qui è arrivata la correzione dalla misura. La regola era stata provata su un diff sintetico e passava, ma provata sui due corpora già lavorati scartava tre domini legittimi, cioè il produttore della soluzione di sicurezza documentata nel ciclo precedente e due console di prodotto. Sono tecnologie che le pagine dichiarano per nome: bloccarle costava evidenze buone senza proteggere nulla, e sono finite in lista di eccezione. Dopo la correzione i falsi positivi sono zero su entrambi i corpora e il corpus di endpoint conserva le stesse trenta evidenze di prima, quindi nessuna regressione. Nel frattempo la regola ha catturato tre fughe reali che nessun pattern copriva, gli hostname interni ospitati presso il provider di hosting, che sono esattamente il tipo di informazione da cui si ricostruisce un'infrastruttura. La distinzione che regge la lista è la stessa di C.14: un prodotto dichiarato come tecnologia è curriculum, un sottodominio di infrastruttura è un sistema di terzi.</w:t>
+      </w:r>
+    </w:p>
+    <w:p>
+      <w:pPr>
+        <w:pStyle w:val="Titolo3"/>
+      </w:pPr>
+      <w:r>
+        <w:t>Rumore che si sposta invece di sparire</w:t>
+      </w:r>
+    </w:p>
+    <w:p>
+      <w:pPr/>
+      <w:r>
+        <w:t xml:space="preserve">Il terzo punto sembrava due righe di codice. Il digest di stato segnalava novecentonovantasei file nuovi su una subfolder, tutti pagine salvate da siti di terzi che non sono materiale da ingerire, e bastava aggiungere quella directory alle esclusioni. Fatto questo, il digest ha cominciato a segnalare duecentonovantuno file </w:t>
+      </w:r>
+      <w:r>
+        <w:rPr>
+          <w:i/>
+        </w:rPr>
+        <w:t>cancellati</w:t>
+      </w:r>
+      <w:r>
+        <w:t>: lo snapshot registrato conteneva ancora i file che ora la scansione non vede più. Un rumore sostituito da un altro.</w:t>
+      </w:r>
+    </w:p>
+    <w:p>
+      <w:pPr/>
+      <w:r>
+        <w:t>La via ovvia sarebbe rifare la registrazione della subfolder, che riscrive lo snapshot. Ma quel comando aggiorna anche la data e il commit dell'ultimo ingest, e dichiarerebbe un ingest mai avvenuto, falsificando l'unico dato di progresso che il file custodisce. È stato quindi aggiunto un comando distinto che riallinea la sola sezione dei file conservando data e commit, con la sua modalità di sola verifica, pensato esattamente per il caso in cui cambiano le regole di esclusione e non il corpus. Applicato dopo aver controllato che tutti e duecentonovantuno i file assorbiti stessero dentro la directory esclusa, il digest è tornato pulito e la data di ingest di metà luglio è intatta. Il confronto dei nomi di directory è anche passato a insensibile al caso, perché su questo sistema la stessa cartella compare indifferentemente maiuscola e minuscola e un confronto sensibile la lasciava passare.</w:t>
+      </w:r>
+    </w:p>
+    <w:p>
+      <w:pPr>
+        <w:pStyle w:val="Titolo3"/>
+      </w:pPr>
+      <w:r>
+        <w:t>L'unica pagina fuori contratto</w:t>
+      </w:r>
+    </w:p>
+    <w:p>
+      <w:pPr/>
+      <w:r>
+        <w:t>Il quarto punto era una Capability che non poteva ricevere evidenze perché il suo indice usciva a zero parole chiave. La diagnosi ha smentito l'ipotesi di partenza, che fosse un parsing troppo rigido: la pagina non aveva nessuna delle quattro intestazioni di contratto, era l'unica così su trentuno, e tutto il suo contenuto, che è ricco, stava sotto cinque intestazioni tematiche che lo script non guarda. Un secondo sintomo dello stesso disallineamento era che l'indice riportava una Capability chiamata Overview, perché il nome viene dall'etichetta della foglia nel nav e quella foglia si chiamava così.</w:t>
+      </w:r>
+    </w:p>
+    <w:p>
+      <w:pPr/>
+      <w:r>
+        <w:t>La pagina è stata portata a contratto senza toccare una parola della prosa, declassando le cinque intestazioni tematiche a terzo livello sotto la sezione delle responsabilità e aggiungendo le tre sezioni mancanti; le sole righe rimosse dal diff sono le cinque intestazioni. Il rischio vero era però un altro, e non stava nel ripristino ma in ciò che il ripristino abilita: una pagina nuova con novanta parole chiave, le più numerose dell'intera tassonomia, che compete con le pagine tecniche su termini generici e ne ruba le evidenze. Per questo la sezione delle tecnologie è stata scritta sul lessico delle competenze trasversali evitando deliberatamente i termini delle pagine tecniche, e soprattutto l'effetto è stato misurato invece che dedotto: zero destinazioni cambiate sui trentuno fit del corpus di endpoint e zero sugli ottantacinque del corpus infrastrutturale. Resta da sapere che quella pagina è ora al taglio massimo delle parole chiave, quindi è la prima da guardare se emerge un instradamento sbagliato.</w:t>
+      </w:r>
+    </w:p>
+    <w:p>
+      <w:pPr>
+        <w:pStyle w:val="Titolo3"/>
+      </w:pPr>
+      <w:r>
+        <w:t>Chiusura</w:t>
+      </w:r>
+    </w:p>
+    <w:p>
+      <w:pPr/>
+      <w:r>
+        <w:t>Quattro voci di coda chiuse, tre script modificati nel motore privato e due file nella tassonomia pubblica, nessuna regressione misurata sui due corpora già lavorati. Resta aperto il prossimo ciclo di ingest, che richiede la scelta della subfolder.</w:t>
+      </w:r>
+    </w:p>
+    <w:p>
+      <w:pPr/>
+      <w:r>
+        <w:t>La lezione di questa sessione è metodologica e vale oltre i quattro casi. Tre volte su quattro la soluzione corretta a ragionamento era sbagliata alla misura: la regola sui domini passava il test sintetico e scartava tre tecnologie dichiarate, la correzione delle esclusioni spostava il rumore invece di toglierlo, e la diagnosi della pagina senza parole chiave puntava sul parsing quando il difetto era editoriale. Il costo della misura è stato ogni volta di pochi minuti, perché i corpora già lavorati sono su disco e gli stati intermedi sono file ispezionabili: è il rendimento di quella scelta architetturale, non un merito della sessione. La regola operativa che ne segue è che una modifica al gate di riservatezza o alla classificazione non si considera fatta finché non è stata rilanciata sui corpora storici e confrontata con l'esito precedente.</w:t>
       </w:r>
     </w:p>
     <w:p>
@@ -17741,6 +17973,36 @@
           <w:szCs w:val="18"/>
         </w:rPr>
         <w:t xml:space="preserve">, Pre-Shared Key - chiave condivisa in anticipo fra due estremi di un tunnel VPN, che compare in chiaro nei file di configurazione dei firewall.</w:t>
+      </w:r>
+    </w:p>
+  </w:footnote>
+  <w:footnote w:id="25">
+    <w:p>
+      <w:pPr>
+        <w:spacing w:after="40"/>
+        <w:jc w:val="both"/>
+      </w:pPr>
+      <w:r>
+        <w:rPr>
+          <w:rStyle w:val="Rimandonotaapidipagina"/>
+        </w:rPr>
+        <w:footnoteRef/>
+      </w:r>
+      <w:r>
+        <w:rPr>
+          <w:color w:val="595959"/>
+          <w:sz w:val="18"/>
+          <w:szCs w:val="18"/>
+        </w:rPr>
+        <w:t xml:space="preserve"> </w:t>
+      </w:r>
+      <w:r>
+        <w:rPr>
+          <w:color w:val="595959"/>
+          <w:sz w:val="18"/>
+          <w:szCs w:val="18"/>
+        </w:rPr>
+        <w:t xml:space="preserve">TLD, Top Level Domain - il suffisso finale di un nome di dominio, per esempio com oppure it, che ne determina il registro di appartenenza.</w:t>
       </w:r>
     </w:p>
   </w:footnote>

</xml_diff>

<commit_message>
Diario C.16 incidente credenziali; sync schede a aa801fa
</commit_message>
<xml_diff>
--- a/diario-tecnico-progetto (lettore-doc + skills-repo).docx
+++ b/diario-tecnico-progetto (lettore-doc + skills-repo).docx
@@ -16982,6 +16982,506 @@
       <w:pPr/>
       <w:r>
         <w:t>La lezione di questa sessione è metodologica e vale oltre i quattro casi. Tre volte su quattro la soluzione corretta a ragionamento era sbagliata alla misura: la regola sui domini passava il test sintetico e scartava tre tecnologie dichiarate, la correzione delle esclusioni spostava il rumore invece di toglierlo, e la diagnosi della pagina senza parole chiave puntava sul parsing quando il difetto era editoriale. Il costo della misura è stato ogni volta di pochi minuti, perché i corpora già lavorati sono su disco e gli stati intermedi sono file ispezionabili: è il rendimento di quella scelta architetturale, non un merito della sessione. La regola operativa che ne segue è che una modifica al gate di riservatezza o alla classificazione non si considera fatta finché non è stata rilanciata sui corpora storici e confrontata con l'esito precedente.</w:t>
+      </w:r>
+    </w:p>
+    <w:p>
+      <w:pPr>
+        <w:pStyle w:val="Titolo2"/>
+      </w:pPr>
+      <w:r>
+        <w:t>C.16 Quattro password sul sito pubblico: l'audit, la bonifica, e il controllo che non esisteva (2026-08-03)</w:t>
+      </w:r>
+    </w:p>
+    <w:p>
+      <w:pPr/>
+      <w:r>
+        <w:t xml:space="preserve">Questa sezione racconta l'incidente peggiore della storia del progetto, trovato mentre si apriva un normale ciclo di ingest. Il sistema pubblicava da mesi quattro credenziali in chiaro, fra cui una di </w:t>
+      </w:r>
+      <w:r>
+        <w:rPr>
+          <w:i/>
+        </w:rPr>
+        <w:t>root</w:t>
+      </w:r>
+      <w:r>
+        <w:t xml:space="preserve"> su SSH, e nessuno dei quattro strati di difesa poteva vederle, perche' nessuno dei quattro le cercava.</w:t>
+      </w:r>
+    </w:p>
+    <w:p>
+      <w:pPr>
+        <w:pStyle w:val="Titolo3"/>
+      </w:pPr>
+      <w:r>
+        <w:t>Come si e' arrivati a guardare</w:t>
+      </w:r>
+    </w:p>
+    <w:p>
+      <w:pPr/>
+      <w:r>
+        <w:t>Il ciclo scelto era la subfolder di documentazione su Trados e GroupShare, quattordici documenti selezionati a mano. L'arricchimento ha subito mostrato un corpus molto piu' denso di dati personali dei precedenti, con sedici persone, sedici indirizzi di rete, dieci hostname e quattro indirizzi di posta, fra cui quello di un dipendente del fornitore.</w:t>
+      </w:r>
+    </w:p>
+    <w:p>
+      <w:pPr/>
+      <w:r>
+        <w:t xml:space="preserve">La misura della regola sui domini di terzi, scritta il giorno prima, ha corretto se stessa: sul nuovo corpus scartava quattro portali del vendore del prodotto che l'intero corpus documenta, quindi sono finiti in allowlist. Anche la mappa di anonimizzazione ha rivelato tre falsi positivi del riconoscitore, che classificava come nomi di persona le etichette di interfaccia in maiuscolo iniziale, fra cui </w:t>
+      </w:r>
+      <w:r>
+        <w:rPr>
+          <w:i/>
+        </w:rPr>
+        <w:t>read only</w:t>
+      </w:r>
+      <w:r>
+        <w:t>, che in un documento sui diritti su un termbase e' il concetto centrale.</w:t>
+      </w:r>
+    </w:p>
+    <w:p>
+      <w:pPr/>
+      <w:r>
+        <w:t xml:space="preserve">Poi la scansione di controllo prima dell'export ha dato un allarme, e l'allarme era sbagliato: avevo cercato le stringhe sensibili nel diff </w:t>
+      </w:r>
+      <w:r>
+        <w:rPr>
+          <w:i/>
+        </w:rPr>
+        <w:t>sanitizzato</w:t>
+      </w:r>
+      <w:r>
+        <w:t>, che per costruzione non e' anonimizzato, perche' la mappa la applica l'export. Rifatta la scansione su cio' che l'export avrebbe davvero scritto, indirizzi, posta, dominio e hostname risultavano tutti mascherati correttamente. Restavano pero' cinque nomi di persona, ed era vero.</w:t>
+      </w:r>
+    </w:p>
+    <w:p>
+      <w:pPr>
+        <w:pStyle w:val="Titolo3"/>
+      </w:pPr>
+      <w:r>
+        <w:t>La fuga vera: i nomi in forma parziale</w:t>
+      </w:r>
+    </w:p>
+    <w:p>
+      <w:pPr/>
+      <w:r>
+        <w:t xml:space="preserve">La mappa sostituisce per stringa esatta, quindi copre </w:t>
+      </w:r>
+      <w:r>
+        <w:rPr>
+          <w:i/>
+        </w:rPr>
+        <w:t>Nome Cognome</w:t>
+      </w:r>
+      <w:r>
+        <w:t xml:space="preserve"> ma non il cognome scritto da solo, e non copre affatto i nomi di battesimo singoli, che l'estrazione scarta di proposito perche' un token isolato e' troppo ambiguo per essere mascherato a monte. Nei documenti reali le persone si citano quasi sempre in forma parziale, e da quando il preview e' ancorato al nodo il testo pubblicato e' contenuto preso dal centro dei documenti, cioe' esattamente il tipo di frase dove i colleghi si nominano per nome.</w:t>
+      </w:r>
+    </w:p>
+    <w:p>
+      <w:pPr/>
+      <w:r>
+        <w:t>La chiusura e' su due livelli. Una regola derivata dai dati, che prende i token delle voci di mappa che sono nomi propri puliti, cioe' esattamente due parole alfabetiche con iniziale maiuscola, e li tratta come residui: cosi' non serve versionare nomi di colleghi in un repository per proteggerli, che sarebbe una contraddizione. E una regola sui termini passati sulla riga di comando, per i nomi che nel corpus compaiono solo in forma singola e non hanno quindi token da cui derivare: li individua la revisione manuale del diff, che e' comunque obbligatoria, e restano fuori da git.</w:t>
+      </w:r>
+    </w:p>
+    <w:p>
+      <w:pPr/>
+      <w:r>
+        <w:t xml:space="preserve">Il criterio stretto sulle due parole non e' un dettaglio. Senza di esso entrano le voci sporche prodotte da uno span troppo largo del riconoscitore, e i loro token comuni fanno scartare testo buono: la stessa lista, costruita senza filtro per l'audit, cercava </w:t>
+      </w:r>
+      <w:r>
+        <w:rPr>
+          <w:i/>
+        </w:rPr>
+        <w:t>with</w:t>
+      </w:r>
+      <w:r>
+        <w:t xml:space="preserve"> e </w:t>
+      </w:r>
+      <w:r>
+        <w:rPr>
+          <w:i/>
+        </w:rPr>
+        <w:t>these</w:t>
+      </w:r>
+      <w:r>
+        <w:t xml:space="preserve"> dentro le licenze dei pacchetti.</w:t>
+      </w:r>
+    </w:p>
+    <w:p>
+      <w:pPr>
+        <w:pStyle w:val="Titolo3"/>
+      </w:pPr>
+      <w:r>
+        <w:t>Il ritrovamento</w:t>
+      </w:r>
+    </w:p>
+    <w:p>
+      <w:pPr/>
+      <w:r>
+        <w:t xml:space="preserve">A quel punto l'audit e' stato esteso all'intero repository pubblico, albero di lavoro e tutti i ventidue commit, con quindici categorie. Il risultato peggiore e' arrivato da una categoria che non esisteva prima di quel momento: </w:t>
+      </w:r>
+      <w:r>
+        <w:rPr>
+          <w:b/>
+        </w:rPr>
+        <w:t>quattro password in chiaro</w:t>
+      </w:r>
+      <w:r>
+        <w:t xml:space="preserve">, dentro il testo di anteprima delle evidenze, su quattro pagine diverse, piu' i codici di backup di un secondo fattore. Una era la password di </w:t>
+      </w:r>
+      <w:r>
+        <w:rPr>
+          <w:i/>
+        </w:rPr>
+        <w:t>root</w:t>
+      </w:r>
+      <w:r>
+        <w:t xml:space="preserve"> per una connessione SSH, una di una casella di posta, una del file che custodisce le credenziali del NAS, una di un account applicativo.</w:t>
+      </w:r>
+    </w:p>
+    <w:p>
+      <w:pPr/>
+      <w:r>
+        <w:t xml:space="preserve">Erano in ogni commit da quando quelle evidenze erano state iniettate, e venivano servite dal sito pubblico e da </w:t>
+      </w:r>
+      <w:r>
+        <w:rPr>
+          <w:rFonts w:ascii="Consolas" w:hAnsi="Consolas"/>
+        </w:rPr>
+        <w:t>raw.githubusercontent.com</w:t>
+      </w:r>
+      <w:r>
+        <w:t>. Il conteggio dei byte serviti, misurato durante l'audit, era di undicimila e di quattromiladuecento.</w:t>
+      </w:r>
+    </w:p>
+    <w:p>
+      <w:pPr>
+        <w:pStyle w:val="Titolo3"/>
+      </w:pPr>
+      <w:r>
+        <w:t>Perche' nessuno strato le vedeva</w:t>
+      </w:r>
+    </w:p>
+    <w:p>
+      <w:pPr/>
+      <w:r>
+        <w:t xml:space="preserve">Il gate copriva indirizzi di rete, indirizzi di posta, hostname, dominio aziendale, fornitori e sedi fisiche, e non aveva </w:t>
+      </w:r>
+      <w:r>
+        <w:rPr>
+          <w:b/>
+        </w:rPr>
+        <w:t>nessuna</w:t>
+      </w:r>
+      <w:r>
+        <w:t xml:space="preserve"> categoria per i segreti. La mappa di anonimizzazione non li modella, perche' una credenziale non e' un'entita' nominata. Il filtro di graphify che scarta i file dal nome sospetto guarda il nome e mai il contenuto, ed e' per di piu' aggirato di proposito da </w:t>
+      </w:r>
+      <w:r>
+        <w:rPr>
+          <w:rFonts w:ascii="Consolas" w:hAnsi="Consolas"/>
+        </w:rPr>
+        <w:t>prepare_graphify_source.py</w:t>
+      </w:r>
+      <w:r>
+        <w:t>, che esiste appunto per recuperare le policy IT scartate a torto per il loro titolo. Il quarto strato, la ricerca manuale delle stringhe sensibili nel diff prima del commit, e' quello che in passato aveva trovato la sola fuga vera del progetto, ma dipende dal sapere cosa cercare, e nessuno aveva mai cercato una password.</w:t>
+      </w:r>
+    </w:p>
+    <w:p>
+      <w:pPr/>
+      <w:r>
+        <w:t xml:space="preserve">Le due lezioni sono queste, e sono costate care. Il </w:t>
+      </w:r>
+      <w:r>
+        <w:rPr>
+          <w:i/>
+        </w:rPr>
+        <w:t>filtro sui nomi non e' un filtro sui contenuti</w:t>
+      </w:r>
+      <w:r>
+        <w:t xml:space="preserve">: se si costruisce uno strumento per aggirare un filtro sui nomi, quello che si aggira va rimpiazzato da un controllo sul contenuto, non lasciato scoperto. E un </w:t>
+      </w:r>
+      <w:r>
+        <w:rPr>
+          <w:i/>
+        </w:rPr>
+        <w:t>controllo che vive nella memoria di chi lavora non e' un controllo</w:t>
+      </w:r>
+      <w:r>
+        <w:t>: funziona finche' qualcuno si ricorda di eseguirlo e sa cosa cercare, e smette di funzionare in silenzio, senza produrre alcun segnale di non aver funzionato.</w:t>
+      </w:r>
+    </w:p>
+    <w:p>
+      <w:pPr>
+        <w:pStyle w:val="Titolo3"/>
+      </w:pPr>
+      <w:r>
+        <w:t>Gli strati aggiunti</w:t>
+      </w:r>
+    </w:p>
+    <w:p>
+      <w:pPr/>
+      <w:r>
+        <w:t xml:space="preserve">Il primo e' una categoria di pattern per i segreti che </w:t>
+      </w:r>
+      <w:r>
+        <w:rPr>
+          <w:b/>
+        </w:rPr>
+        <w:t>scarta</w:t>
+      </w:r>
+      <w:r>
+        <w:t xml:space="preserve"> l'evidenza invece di mascherarla. La distinzione dagli altri residui e' voluta: un residuo e' un dato scappato dentro un testo altrimenti utile, mentre una credenziale in chiaro dice che quel punto del documento e' un deposito di credenziali, e mascherare il valore lascerebbe pubblicato a quale sistema e a quale utenza appartiene. Il pattern chiede che il valore abbia la forma di una credenziale, con un vincolo di lunghezza espresso da un lookahead invece che contando i caratteri attorno al simbolo, perche' quella prima forma dipendeva da dove cadeva la cifra e mancava i valori con le cifre in fondo. Le forme senza separatore hanno una regola propria, da cui e' esclusa la congiunzione </w:t>
+      </w:r>
+      <w:r>
+        <w:rPr>
+          <w:i/>
+        </w:rPr>
+        <w:t>e</w:t>
+      </w:r>
+      <w:r>
+        <w:t xml:space="preserve">, che in italiano compare in ogni frase e faceva scartare la descrizione di una policy di complessita' come se fosse una password. E una regola distinta riconosce la </w:t>
+      </w:r>
+      <w:r>
+        <w:rPr>
+          <w:i/>
+        </w:rPr>
+        <w:t>scheda</w:t>
+      </w:r>
+      <w:r>
+        <w:t xml:space="preserve"> di credenziali, cioe' la parola credenziali accostata a un identificativo di utenza, per il caso in cui il valore sta oltre i trecento caratteri del preview ma il blocco e' comunque un registro di accessi.</w:t>
+      </w:r>
+    </w:p>
+    <w:p>
+      <w:pPr/>
+      <w:r>
+        <w:t>Il secondo e' la dichiarazione, da parte del gate, dei nodi che ha scartato. E' l'aggiunta piu' importante e la piu' facile da non vedere. Un'evidenza scartata sparisce dal diff, quindi la passata di rimozione dell'export non la vede nemmeno come nodo conosciuto, e il blocco gia' pubblicato resta orfano per sempre: senza questa riga il gate poteva impedire una pubblicazione nuova ma non annullarne una vecchia, ed e' cosi' che le quattro password sarebbero rimaste sul sito anche dopo aver scritto la regola che le riconosce. Una difesa che non sa disfare cio' che ha lasciato passare prima di esistere e' una difesa a meta'.</w:t>
+      </w:r>
+    </w:p>
+    <w:p>
+      <w:pPr/>
+      <w:r>
+        <w:t>Il terzo e' la neutralizzazione dei marcatori Markdown nel preview. Un preview che cominciava con dei cancelletti, appiattito su una riga sola, diventava una vera intestazione dentro la sezione delle evidenze, e siccome le intestazioni sono i confini su cui la delimitazione dei blocchi si appoggia, la riscrittura successiva si fermava a quella riga e lasciava in pagina la coda del blocco vecchio, fuori da ogni ancora. Da quel momento nessuna passata poteva piu' toccarla, perche' non era un blocco: non si riscriveva e non si rimuoveva. Serviva quindi anche una riparazione, che e' la sola via prevista per quelle pagine, dato che l'intervento a mano sulle sezioni delle evidenze e' vietato per ragioni giuste.</w:t>
+      </w:r>
+    </w:p>
+    <w:p>
+      <w:pPr/>
+      <w:r>
+        <w:t xml:space="preserve">Il quarto e' </w:t>
+      </w:r>
+      <w:r>
+        <w:rPr>
+          <w:rFonts w:ascii="Consolas" w:hAnsi="Consolas"/>
+        </w:rPr>
+        <w:t>verify_public_repo.py</w:t>
+      </w:r>
+      <w:r>
+        <w:t xml:space="preserve">, che rende il controllo eseguibile e ripetibile invece di affidarlo al ricordarsi di farlo, con un codice di uscita che lo rende utilizzabile come cancello. Importa i pattern dal gate invece di duplicarli, perche' un verificatore con una propria copia delle regole diverge al primo aggiornamento e a quel punto dichiara pulito qualcosa che il gate impedisce, o viceversa. La sola categoria che costruisce da se' sono i nomi di persona, che deriva dalle mappe dei corpora lavorati in locale. Su di esso poggia un hook di </w:t>
+      </w:r>
+      <w:r>
+        <w:rPr>
+          <w:rFonts w:ascii="Consolas" w:hAnsi="Consolas"/>
+        </w:rPr>
+        <w:t>pre-commit</w:t>
+      </w:r>
+      <w:r>
+        <w:t xml:space="preserve"> nel repository pubblico, la cui sorgente e' versionata nel progetto e non soltanto installata, perche' la cartella degli hook non appartiene a nessun repository e su una macchina nuova non esisterebbe.</w:t>
+      </w:r>
+    </w:p>
+    <w:p>
+      <w:pPr/>
+      <w:r>
+        <w:t xml:space="preserve">Un principio operativo ha guidato l'affinamento di tutte queste regole: un verificatore che segnala sempre qualcosa insegna a ignorarlo. Ogni falso positivo trovato e' stato tolto con la stessa cura dedicata ai veri positivi, e la prima stesura ne produceva su quattro pagine per la parola Windows scritta in maiuscolo, sul costo in token stampato da un report, sul permesso </w:t>
+      </w:r>
+      <w:r>
+        <w:rPr>
+          <w:rFonts w:ascii="Consolas" w:hAnsi="Consolas"/>
+        </w:rPr>
+        <w:t>token: write</w:t>
+      </w:r>
+      <w:r>
+        <w:t xml:space="preserve"> di un workflow e sull'identita' dichiarata del proprietario del profilo.</w:t>
+      </w:r>
+    </w:p>
+    <w:p>
+      <w:pPr>
+        <w:pStyle w:val="Titolo3"/>
+      </w:pPr>
+      <w:r>
+        <w:t>Due errori commessi durante la bonifica</w:t>
+      </w:r>
+    </w:p>
+    <w:p>
+      <w:pPr/>
+      <w:r>
+        <w:t xml:space="preserve">Il primo. Portare la pagina delle competenze trasversali al contratto delle quattro intestazioni le aveva dato novanta parole chiave, le piu' numerose della tassonomia, e la misura su due corpora diceva zero destinazioni cambiate. Sui due corpora non misurati la pagina ha cominciato a ricevere funzioni PowerShell, perche' con etichette di due token una sola sovrapposizione fa punteggio zero virgola cinque e vince, e la pagina con piu' parole chiave e' quella con piu' probabilita' di sovrapporsi per caso. La misura era stata fatta, ma non su tutto cio' che era disponibile: </w:t>
+      </w:r>
+      <w:r>
+        <w:rPr>
+          <w:i/>
+        </w:rPr>
+        <w:t>misurare su un sottoinsieme e' meglio che non misurare, e non equivale a misurare</w:t>
+      </w:r>
+      <w:r>
+        <w:t>. La pagina e' ora esclusa dalla classificazione automatica con una costante dichiarata, perche' nessun nodo estratto da una procedura IT e' evidenza di una competenza trasversale. Lo zero parole chiave era il comportamento giusto, raggiunto prima per la ragione sbagliata.</w:t>
+      </w:r>
+    </w:p>
+    <w:p>
+      <w:pPr/>
+      <w:r>
+        <w:t>Il secondo. La prima stesura della riparazione strutturale trattava come corruzione ogni blocco privo di ancora e ogni intestazione di secondo livello dentro la sezione, e ha cancellato contenuto scritto a mano, due voci di progetto redatte dall'autore e una sezione di dichiarazione dei limiti, tutte risalenti al commit di migrazione iniziale. Ripristinate con un ripristino dell'albero, la regola e' stata ristretta a cio' che porta la firma del difetto, cioe' una intestazione il cui testo e' prosa narrativa invece di un'etichetta. Nella sezione delle evidenze convivono legittimamente le voci iniettate e quelle scritte a mano, e uno strumento che pulisce non ha il diritto di presumere il contrario.</w:t>
+      </w:r>
+    </w:p>
+    <w:p>
+      <w:pPr>
+        <w:pStyle w:val="Titolo3"/>
+      </w:pPr>
+      <w:r>
+        <w:t>La politica sui fornitori, resa coerente</w:t>
+      </w:r>
+    </w:p>
+    <w:p>
+      <w:pPr/>
+      <w:r>
+        <w:t>Le pagine dichiaravano a mano i provider di hosting per nome nella sezione delle tecnologie, mentre il gate trattava gli stessi nomi come dati sensibili e scartava le evidenze che li nominavano: lo stesso nome era curriculum in una sezione e segreto in quella accanto. E' la medesima incoerenza risolta a luglio per la ragione sociale. La distinzione adottata separa il nome, che dice con chi si lavora, dall'identificativo di una macchina presso quel fornitore, che dice come si e' fatti dentro. Il dominio nudo passa, qualunque sottodominio no, e le tre regole per nome sono state rimosse lasciando nel codice l'indicazione di come reintrodurle.</w:t>
+      </w:r>
+    </w:p>
+    <w:p>
+      <w:pPr>
+        <w:pStyle w:val="Titolo3"/>
+      </w:pPr>
+      <w:r>
+        <w:t>La bonifica, e cosa il push forzato non fa</w:t>
+      </w:r>
+    </w:p>
+    <w:p>
+      <w:pPr/>
+      <w:r>
+        <w:t>L'albero di lavoro e' stato bonificato interamente dalla pipeline, senza un solo intervento a mano sulle sezioni delle evidenze: cinque cicli rigenerati con le regole nuove, duecentoventiquattro evidenze riscritte, quindici collocamenti obsoleti rimossi, due pagine riparate, e il verificatore passato da diciassette riscontri a zero.</w:t>
+      </w:r>
+    </w:p>
+    <w:p>
+      <w:pPr/>
+      <w:r>
+        <w:t xml:space="preserve">La storia e' stata riscritta con un commit unico su un ramo orfano e un push forzato. Poi la misura ha smentito l'aspettativa: cinque dei vecchi commit rispondevano ancora </w:t>
+      </w:r>
+      <w:r>
+        <w:rPr>
+          <w:rFonts w:ascii="Consolas" w:hAnsi="Consolas"/>
+        </w:rPr>
+        <w:t>200</w:t>
+      </w:r>
+      <w:r>
+        <w:t xml:space="preserve"> sull'API pubblica, e </w:t>
+      </w:r>
+      <w:r>
+        <w:rPr>
+          <w:rFonts w:ascii="Consolas" w:hAnsi="Consolas"/>
+        </w:rPr>
+        <w:t>raw.githubusercontent.com</w:t>
+      </w:r>
+      <w:r>
+        <w:t xml:space="preserve"> serviva ancora il contenuto dei due file con le password. </w:t>
+      </w:r>
+      <w:r>
+        <w:rPr>
+          <w:i/>
+        </w:rPr>
+        <w:t>Il push forzato sposta un riferimento, non cancella oggetti.</w:t>
+      </w:r>
+      <w:r>
+        <w:t xml:space="preserve"> Con zero fork e zero stelle la strada completa e immediata era cancellare e ricreare il repository, che elimina davvero gli oggetti e porta via con se' anche gli artifact e i log delle esecuzioni passate, dove il sito costruito conteneva le stesse pagine.</w:t>
+      </w:r>
+    </w:p>
+    <w:p>
+      <w:pPr/>
+      <w:r>
+        <w:t xml:space="preserve">Ogni verifica e' stata fatta con un controllo di validita' accanto, e serviva: un primo test dichiarava i vecchi commit irraggiungibili, ma dava lo stesso esito sul commit nuovo, quindi non misurava niente. Dopo la ricreazione, con il commit attuale che risponde </w:t>
+      </w:r>
+      <w:r>
+        <w:rPr>
+          <w:rFonts w:ascii="Consolas" w:hAnsi="Consolas"/>
+        </w:rPr>
+        <w:t>200</w:t>
+      </w:r>
+      <w:r>
+        <w:t xml:space="preserve">, i vecchi rispondono </w:t>
+      </w:r>
+      <w:r>
+        <w:rPr>
+          <w:rFonts w:ascii="Consolas" w:hAnsi="Consolas"/>
+        </w:rPr>
+        <w:t>422</w:t>
+      </w:r>
+      <w:r>
+        <w:t>, che su quell'endpoint e' la risposta per uno SHA</w:t>
+      </w:r>
+      <w:r>
+        <w:rPr>
+          <w:rStyle w:val="Rimandonotaapidipagina"/>
+        </w:rPr>
+        <w:footnoteReference w:id="26"/>
+      </w:r>
+      <w:r>
+        <w:t xml:space="preserve"> assente, e il contenuto su </w:t>
+      </w:r>
+      <w:r>
+        <w:rPr>
+          <w:rFonts w:ascii="Consolas" w:hAnsi="Consolas"/>
+        </w:rPr>
+        <w:t>raw</w:t>
+      </w:r>
+      <w:r>
+        <w:t xml:space="preserve"> risponde </w:t>
+      </w:r>
+      <w:r>
+        <w:rPr>
+          <w:rFonts w:ascii="Consolas" w:hAnsi="Consolas"/>
+        </w:rPr>
+        <w:t>404</w:t>
+      </w:r>
+      <w:r>
+        <w:t>.</w:t>
+      </w:r>
+    </w:p>
+    <w:p>
+      <w:pPr/>
+      <w:r>
+        <w:t xml:space="preserve">Un ultimo inciampo, e la sua morale. Per non far dipendere il deploy da un passo manuale avevo aggiunto al workflow l'abilitazione automatica delle Pages, e il primo deploy sul repository ricreato e' fallito proprio su quel passo, perche' il token del workflow non ha i diritti per abilitare Pages dove non e' mai stato attivo. Rimosso il passo, il workflow e' tornato ai cinque che funzionavano da mesi e il sito e' ripubblicato. </w:t>
+      </w:r>
+      <w:r>
+        <w:rPr>
+          <w:i/>
+        </w:rPr>
+        <w:t>Un miglioramento introdotto durante un intervento di emergenza va misurato come tutto il resto</w:t>
+      </w:r>
+      <w:r>
+        <w:t>, e la scelta prudente e' tornare alla configurazione nota.</w:t>
+      </w:r>
+    </w:p>
+    <w:p>
+      <w:pPr>
+        <w:pStyle w:val="Titolo3"/>
+      </w:pPr>
+      <w:r>
+        <w:t>Chiusura</w:t>
+      </w:r>
+    </w:p>
+    <w:p>
+      <w:pPr/>
+      <w:r>
+        <w:t>Sito ripubblicato e verificato pulito sulle pagine servite, repository con un solo commit, albero e storia puliti secondo il verificatore, cancello di pre-commit installato e provato in entrambe le direzioni. Il ciclo di ingest che aveva fatto partire tutto questo e' rimasto fermo al gate, con trentotto evidenze pronte e quattordici fit marcati da verificare.</w:t>
+      </w:r>
+    </w:p>
+    <w:p>
+      <w:pPr/>
+      <w:r>
+        <w:t xml:space="preserve">Resta una cosa che nessun passo tecnico di questa giornata ha risolto, e va scritta qui perche' e' la conclusione piu' importante: quelle quattro credenziali sono state servite pubblicamente per mesi, quindi vanno considerate note, e la sola rimediazione reale e' la loro rotazione. Rimuovere un segreto da un repository pubblico ferma l'esposizione futura e non tocca quella passata. Un sistema che pubblica deve percio' avere un controllo sui segreti </w:t>
+      </w:r>
+      <w:r>
+        <w:rPr>
+          <w:i/>
+        </w:rPr>
+        <w:t>prima</w:t>
+      </w:r>
+      <w:r>
+        <w:t xml:space="preserve"> del primo commit, non dopo il primo incidente: e' il tipo di difesa il cui valore si misura solo in cio' che non e' mai accaduto.</w:t>
       </w:r>
     </w:p>
     <w:p>
@@ -18003,6 +18503,45 @@
           <w:szCs w:val="18"/>
         </w:rPr>
         <w:t xml:space="preserve">TLD, Top Level Domain - il suffisso finale di un nome di dominio, per esempio com oppure it, che ne determina il registro di appartenenza.</w:t>
+      </w:r>
+    </w:p>
+  </w:footnote>
+  <w:footnote w:id="26">
+    <w:p>
+      <w:pPr>
+        <w:spacing w:after="40"/>
+        <w:jc w:val="both"/>
+      </w:pPr>
+      <w:r>
+        <w:rPr>
+          <w:rStyle w:val="Rimandonotaapidipagina"/>
+        </w:rPr>
+        <w:footnoteRef/>
+      </w:r>
+      <w:r>
+        <w:rPr>
+          <w:color w:val="595959"/>
+          <w:sz w:val="18"/>
+          <w:szCs w:val="18"/>
+        </w:rPr>
+        <w:t xml:space="preserve"> </w:t>
+      </w:r>
+      <w:r>
+        <w:rPr>
+          <w:i/>
+          <w:color w:val="595959"/>
+          <w:sz w:val="18"/>
+          <w:szCs w:val="18"/>
+        </w:rPr>
+        <w:t xml:space="preserve">SHA</w:t>
+      </w:r>
+      <w:r>
+        <w:rPr>
+          <w:color w:val="595959"/>
+          <w:sz w:val="18"/>
+          <w:szCs w:val="18"/>
+        </w:rPr>
+        <w:t xml:space="preserve">, Secure Hash Algorithm - la funzione di hash con cui git identifica ogni oggetto del repository; l'identificativo di un commit e' il suo digest, e un oggetto resta recuperabile per digest anche quando nessun ramo lo raggiunge piu'.</w:t>
       </w:r>
     </w:p>
   </w:footnote>

</xml_diff>

<commit_message>
Diario C.17 ciclo RWS e trilingue; sync schede a fee90a6
</commit_message>
<xml_diff>
--- a/diario-tecnico-progetto (lettore-doc + skills-repo).docx
+++ b/diario-tecnico-progetto (lettore-doc + skills-repo).docx
@@ -17482,6 +17482,175 @@
       </w:r>
       <w:r>
         <w:t xml:space="preserve"> del primo commit, non dopo il primo incidente: e' il tipo di difesa il cui valore si misura solo in cio' che non e' mai accaduto.</w:t>
+      </w:r>
+    </w:p>
+    <w:p>
+      <w:pPr>
+        <w:pStyle w:val="Titolo2"/>
+      </w:pPr>
+      <w:r>
+        <w:t>C.17 Ciclo Helpdesk RWS GroupShare Studio, e la tassonomia in tre lingue (2026-08-04)</w:t>
+      </w:r>
+    </w:p>
+    <w:p>
+      <w:pPr/>
+      <w:r>
+        <w:t>Il ciclo di ingest che ha aperto la giornata precedente si chiude qui. E' il ciclo che, arrivando alla scansione prima della pubblicazione, ha fatto emergere le quattro credenziali pubblicate di cui racconta la sezione C.16: il suo merito principale e' quindi di essere stato interrotto al momento giusto.</w:t>
+      </w:r>
+    </w:p>
+    <w:p>
+      <w:pPr>
+        <w:pStyle w:val="Titolo3"/>
+      </w:pPr>
+      <w:r>
+        <w:t>Selezione, e un nome neutralizzato all'ingresso</w:t>
+      </w:r>
+    </w:p>
+    <w:p>
+      <w:pPr/>
+      <w:r>
+        <w:t xml:space="preserve">La subfolder contiene centoquarantaquattro file, di cui ventitre di testo o PDF. Ne sono stati selezionati quattordici, escludendo per decisione esplicita un questionario commerciale di pre-vendita e un modulo di adesione a un programma partner, che sono materiale contrattuale e non evidenza tecnica, coerentemente con l'esclusione dei questionari fornitori gia' in atto. I sette PDF sono fuori per costruzione, perche' la pipeline processa </w:t>
+      </w:r>
+      <w:r>
+        <w:rPr>
+          <w:rFonts w:ascii="Consolas" w:hAnsi="Consolas"/>
+        </w:rPr>
+        <w:t>.docx</w:t>
+      </w:r>
+      <w:r>
+        <w:t xml:space="preserve">, </w:t>
+      </w:r>
+      <w:r>
+        <w:rPr>
+          <w:rFonts w:ascii="Consolas" w:hAnsi="Consolas"/>
+        </w:rPr>
+        <w:t>.txt</w:t>
+      </w:r>
+      <w:r>
+        <w:t xml:space="preserve"> e </w:t>
+      </w:r>
+      <w:r>
+        <w:rPr>
+          <w:rFonts w:ascii="Consolas" w:hAnsi="Consolas"/>
+        </w:rPr>
+        <w:t>.md</w:t>
+      </w:r>
+      <w:r>
+        <w:t>, e fra loro ci sono due guide di installazione che, se interessano, vanno convertite a monte.</w:t>
+      </w:r>
+    </w:p>
+    <w:p>
+      <w:pPr/>
+      <w:r>
+        <w:t xml:space="preserve">Un documento e' stato rinominato all'ingresso: il suo nome conteneva il nome proprio di una collega, e la mappa di anonimizzazione riconosce i nomi propri solo in forma nome piu' cognome, quindi un nome singolo dentro un nome di file non sarebbe stato mascherato. E' il vettore chiuso nel ciclo C.13, e la lezione e' che va guardato </w:t>
+      </w:r>
+      <w:r>
+        <w:rPr>
+          <w:i/>
+        </w:rPr>
+        <w:t>prima</w:t>
+      </w:r>
+      <w:r>
+        <w:t xml:space="preserve"> di copiare i documenti, non dopo.</w:t>
+      </w:r>
+    </w:p>
+    <w:p>
+      <w:pPr>
+        <w:pStyle w:val="Titolo3"/>
+      </w:pPr>
+      <w:r>
+        <w:t>Un corpus piu' denso di dati personali dei precedenti</w:t>
+      </w:r>
+    </w:p>
+    <w:p>
+      <w:pPr/>
+      <w:r>
+        <w:t xml:space="preserve">L'arricchimento ha prodotto sedici persone, sedici indirizzi di rete, dieci hostname e quattro indirizzi di posta, fra cui quello di un dipendente del fornitore. Su questo corpus sono emersi tre falsi positivi del riconoscitore, che classificava come nomi di persona le etichette di interfaccia in maiuscolo iniziale, fra cui </w:t>
+      </w:r>
+      <w:r>
+        <w:rPr>
+          <w:i/>
+        </w:rPr>
+        <w:t>read only</w:t>
+      </w:r>
+      <w:r>
+        <w:t xml:space="preserve">, che in un documento sui diritti su un termbase e' il concetto centrale, e </w:t>
+      </w:r>
+      <w:r>
+        <w:rPr>
+          <w:i/>
+        </w:rPr>
+        <w:t>Pacchetti Worldserver</w:t>
+      </w:r>
+      <w:r>
+        <w:t xml:space="preserve">, che e' un prodotto. Aggiunti alla stoplist i termini dell'ecosistema documentato, con il criterio di non inserire parole generiche: il filtro scarta l'intero candidato se un solo token compare nella lista, quindi un termine comune come </w:t>
+      </w:r>
+      <w:r>
+        <w:rPr>
+          <w:i/>
+        </w:rPr>
+        <w:t>manager</w:t>
+      </w:r>
+      <w:r>
+        <w:t xml:space="preserve"> farebbe cadere uno span che contiene un cognome vero, lasciandolo non mascherato.</w:t>
+      </w:r>
+    </w:p>
+    <w:p>
+      <w:pPr/>
+      <w:r>
+        <w:t>Il gate ha scartato una sola evidenza, la scheda credenziali di Trados Enterprise, riconosciuta dalla regola che cerca la parola credenziali accostata a un identificativo di utenza: il valore stava oltre i trecento caratteri del preview, quindi la regola sul valore non sarebbe scattata, ed e' il caso per cui quella regola distinta esiste.</w:t>
+      </w:r>
+    </w:p>
+    <w:p>
+      <w:pPr/>
+      <w:r>
+        <w:t>Esito: trentotto evidenze su nove Capability, con quattordici fit su trentotto marcati da verificare, e la revisione manuale ha confermato le destinazioni. Identificativi di evidenza pubblicati da duecentoquarantasei a duecentottantaquattro, senza perdite, con le quattro intestazioni di contratto intatte su tutte le pagine toccate e la scansione delle sole righe aggiunte del diff reale pulita.</w:t>
+      </w:r>
+    </w:p>
+    <w:p>
+      <w:pPr>
+        <w:pStyle w:val="Titolo3"/>
+      </w:pPr>
+      <w:r>
+        <w:t>La tassonomia in tre lingue</w:t>
+      </w:r>
+    </w:p>
+    <w:p>
+      <w:pPr/>
+      <w:r>
+        <w:t>Nella stessa sessione il sito pubblico e' diventato trilingue, italiano, inglese e spagnolo intercambiabili, con lo stesso impianto gia' adottato per il sito dei progetti: plugin di internazionalizzazione a struttura per suffisso e ripiego sulla lingua di default, che e' la scelta che rende il lavoro sostenibile, perche' una pagina non ancora tradotta resta visibile invece di dare errore e la traduzione avanza una pagina alla volta.</w:t>
+      </w:r>
+    </w:p>
+    <w:p>
+      <w:pPr/>
+      <w:r>
+        <w:t>La lingua di default e' l'inglese e non l'italiano come sugli altri siti, per una ragione tecnica e non editoriale: i file senza suffisso sono quelli in cui la pipeline inietta, l'identificativo stabile di un'evidenza contiene lo slug del file, e le quattro intestazioni di contratto su cui gli script si appoggiano sono in inglese. Tenere l'inglese come default lascia intatti gli URL esistenti e gli identificativi gia' pubblicati; il prezzo e' un clic sull'interruttore per chi arriva da un altro sito del portfolio.</w:t>
+      </w:r>
+    </w:p>
+    <w:p>
+      <w:pPr/>
+      <w:r>
+        <w:t>La modifica alla pipeline e' piccola e ha un punto delicato. L'export scrive le evidenze in tutte le varianti di lingua esistenti, perche' con questo plugin una pagina tradotta sostituisce integralmente quella di default per la propria lingua, e una traduzione priva della sezione delle evidenze mostrerebbe il lavoro in una lingua sola. Lo slug per l'identificativo si calcola pero' togliendo il suffisso di lingua: senza quel passaggio la stessa evidenza prenderebbe tre identificativi diversi e diventerebbe impossibile riconoscerla, riscriverla o rimuoverla. L'unita' di identita' e' la Capability, non la sua traduzione.</w:t>
+      </w:r>
+    </w:p>
+    <w:p>
+      <w:pPr/>
+      <w:r>
+        <w:t>Un dettaglio che vale come conferma degli strumenti aggiunti il giorno prima: il verificatore ha bloccato un commento scritto nella configurazione del sito pubblico, dove un esempio di nome di file con il codice di lingua veniva letto come un nome di dominio di terzi. E' il falso positivo previsto quando quella regola era stata scritta, ed e' corretto che scatti: il commento e' stato riformulato, e ora spiega perche' quella forma non si scrive in un file pubblicato.</w:t>
+      </w:r>
+    </w:p>
+    <w:p>
+      <w:pPr>
+        <w:pStyle w:val="Titolo3"/>
+      </w:pPr>
+      <w:r>
+        <w:t>Chiusura</w:t>
+      </w:r>
+    </w:p>
+    <w:p>
+      <w:pPr/>
+      <w:r>
+        <w:t>Ciclo chiuso: commit del repository pubblico registrato nello stato di ingest, sito ripubblicato nelle tre lingue e verificato pulito sulle pagine nuove. Restano da tradurre trenta pagine di Capability piu' quella delle competenze trasversali, che e' lavoro di contenuto e procede per domini.</w:t>
       </w:r>
     </w:p>
     <w:p>

</xml_diff>

<commit_message>
Diario: C.18 ciclo gestionale, fix nomi comuni italiani nel gate
</commit_message>
<xml_diff>
--- a/diario-tecnico-progetto (lettore-doc + skills-repo).docx
+++ b/diario-tecnico-progetto (lettore-doc + skills-repo).docx
@@ -17651,6 +17651,1070 @@
       <w:pPr/>
       <w:r>
         <w:t>Ciclo chiuso: commit del repository pubblico registrato nello stato di ingest, sito ripubblicato nelle tre lingue e verificato pulito sulle pagine nuove. Restano da tradurre trenta pagine di Capability piu' quella delle competenze trasversali, che e' lavoro di contenuto e procede per domini.</w:t>
+      </w:r>
+    </w:p>
+    <w:p>
+      <w:pPr>
+        <w:pStyle w:val="Titolo2"/>
+      </w:pPr>
+      <w:r>
+        <w:t>C.18 Ciclo Helpdesk T-Rex, e i falsi nomi propri del riconoscitore italiano (2026-08-05)</w:t>
+      </w:r>
+    </w:p>
+    <w:p>
+      <w:pPr/>
+      <w:r>
+        <w:t xml:space="preserve">Il ciclo su </w:t>
+      </w:r>
+      <w:r>
+        <w:rPr>
+          <w:rFonts w:ascii="Consolas" w:hAnsi="Consolas"/>
+        </w:rPr>
+        <w:t>Helpdesk_T-Rex</w:t>
+      </w:r>
+      <w:r>
+        <w:t xml:space="preserve"> era il primo dopo la riapertura, con nessun debito aperto ereditato da C.17. La cartella sorgente su OneDrive contiene </w:t>
+      </w:r>
+      <w:r>
+        <w:rPr>
+          <w:i/>
+        </w:rPr>
+        <w:t>quarantuno</w:t>
+      </w:r>
+      <w:r>
+        <w:t xml:space="preserve"> documenti processabili, mescolati a molto materiale non tecnico: presentazioni verso i clienti </w:t>
+      </w:r>
+      <w:r>
+        <w:rPr>
+          <w:i/>
+        </w:rPr>
+        <w:t>Angelini</w:t>
+      </w:r>
+      <w:r>
+        <w:t xml:space="preserve">, </w:t>
+      </w:r>
+      <w:r>
+        <w:rPr>
+          <w:i/>
+        </w:rPr>
+        <w:t>EniVIPA</w:t>
+      </w:r>
+      <w:r>
+        <w:t xml:space="preserve"> e </w:t>
+      </w:r>
+      <w:r>
+        <w:rPr>
+          <w:i/>
+        </w:rPr>
+        <w:t>FAE</w:t>
+      </w:r>
+      <w:r>
+        <w:t xml:space="preserve">, catene di email </w:t>
+      </w:r>
+      <w:r>
+        <w:rPr>
+          <w:rFonts w:ascii="Consolas" w:hAnsi="Consolas"/>
+        </w:rPr>
+        <w:t>.eml</w:t>
+      </w:r>
+      <w:r>
+        <w:t xml:space="preserve"> sui singoli ticket, screenshot di fatture, note di credito, ordini di acquisto, file con nomi propri di persona come </w:t>
+      </w:r>
+      <w:r>
+        <w:rPr>
+          <w:rFonts w:ascii="Consolas" w:hAnsi="Consolas"/>
+        </w:rPr>
+        <w:t>NASTASI LUIGI DOMENICO_...</w:t>
+      </w:r>
+      <w:r>
+        <w:t xml:space="preserve">, </w:t>
+      </w:r>
+      <w:r>
+        <w:rPr>
+          <w:rFonts w:ascii="Consolas" w:hAnsi="Consolas"/>
+        </w:rPr>
+        <w:t>Quartara Ts.docx</w:t>
+      </w:r>
+      <w:r>
+        <w:t xml:space="preserve"> e </w:t>
+      </w:r>
+      <w:r>
+        <w:rPr>
+          <w:rFonts w:ascii="Consolas" w:hAnsi="Consolas"/>
+        </w:rPr>
+        <w:t>Autorizzazioni utente Roberta Vergani</w:t>
+      </w:r>
+      <w:r>
+        <w:t xml:space="preserve">. La regola documentata su questo passo dice di escludere il materiale contrattuale e commerciale, i dati di terzi, e i documenti il cui nome contiene un dato personale, che va neutralizzato all'ingresso: la selezione manuale ha portato a </w:t>
+      </w:r>
+      <w:r>
+        <w:rPr>
+          <w:i/>
+        </w:rPr>
+        <w:t>ventiquattro</w:t>
+      </w:r>
+      <w:r>
+        <w:t xml:space="preserve"> documenti su quarantuno, in prevalenza documentazione tecnica pura del gestionale T-Rex, procedure di magazzino, cambio anno delle sequenze di fatturazione, tour registrati del prodotto, note sull'upgrade </w:t>
+      </w:r>
+      <w:r>
+        <w:rPr>
+          <w:i/>
+        </w:rPr>
+        <w:t>GroupShare</w:t>
+      </w:r>
+      <w:r>
+        <w:t xml:space="preserve"> e appunti sulla configurazione IMAP di </w:t>
+      </w:r>
+      <w:r>
+        <w:rPr>
+          <w:i/>
+        </w:rPr>
+        <w:t>Exchange Online</w:t>
+      </w:r>
+      <w:r>
+        <w:t xml:space="preserve">. Il file </w:t>
+      </w:r>
+      <w:r>
+        <w:rPr>
+          <w:rFonts w:ascii="Consolas" w:hAnsi="Consolas"/>
+        </w:rPr>
+        <w:t>102025 - Note migrazione gestionale (call con Favale).txt</w:t>
+      </w:r>
+      <w:r>
+        <w:t xml:space="preserve"> e' stato rinominato in </w:t>
+      </w:r>
+      <w:r>
+        <w:rPr>
+          <w:rFonts w:ascii="Consolas" w:hAnsi="Consolas"/>
+        </w:rPr>
+        <w:t>102025 - Note migrazione gestionale.txt</w:t>
+      </w:r>
+      <w:r>
+        <w:t xml:space="preserve"> alla copia, per togliere il nome della persona dal nome file prima ancora del pre-flight.</w:t>
+      </w:r>
+    </w:p>
+    <w:p>
+      <w:pPr/>
+      <w:r>
+        <w:t xml:space="preserve">Il passo 0 di </w:t>
+      </w:r>
+      <w:r>
+        <w:rPr>
+          <w:rFonts w:ascii="Consolas" w:hAnsi="Consolas"/>
+        </w:rPr>
+        <w:t>prepare_graphify_source.py</w:t>
+      </w:r>
+      <w:r>
+        <w:t xml:space="preserve"> ha segnalato un unico file da neutralizzare per il nome, </w:t>
+      </w:r>
+      <w:r>
+        <w:rPr>
+          <w:rFonts w:ascii="Consolas" w:hAnsi="Consolas"/>
+        </w:rPr>
+        <w:t>Problema CSRF Token T_Rex.docx</w:t>
+      </w:r>
+      <w:r>
+        <w:t xml:space="preserve">, che il filtro di </w:t>
+      </w:r>
+      <w:r>
+        <w:rPr>
+          <w:rFonts w:ascii="Consolas" w:hAnsi="Consolas"/>
+        </w:rPr>
+        <w:t>graphify</w:t>
+      </w:r>
+      <w:r>
+        <w:t xml:space="preserve"> scarterebbe per la parola </w:t>
+      </w:r>
+      <w:r>
+        <w:rPr>
+          <w:i/>
+        </w:rPr>
+        <w:t>token</w:t>
+      </w:r>
+      <w:r>
+        <w:t xml:space="preserve">. La mappa di sostituzione ha reso il nome in </w:t>
+      </w:r>
+      <w:r>
+        <w:rPr>
+          <w:rFonts w:ascii="Consolas" w:hAnsi="Consolas"/>
+        </w:rPr>
+        <w:t>Problema CSRF chiave T_Rex.md</w:t>
+      </w:r>
+      <w:r>
+        <w:t xml:space="preserve">, che e' descrittivo e passa il filtro. Poi </w:t>
+      </w:r>
+      <w:r>
+        <w:rPr>
+          <w:rFonts w:ascii="Consolas" w:hAnsi="Consolas"/>
+        </w:rPr>
+        <w:t>/graphify</w:t>
+      </w:r>
+      <w:r>
+        <w:t xml:space="preserve"> sulla cartella </w:t>
+      </w:r>
+      <w:r>
+        <w:rPr>
+          <w:rFonts w:ascii="Consolas" w:hAnsi="Consolas"/>
+        </w:rPr>
+        <w:t>_intermediate\src\Helpdesk-T-Rex-sanitized\</w:t>
+      </w:r>
+      <w:r>
+        <w:t xml:space="preserve"> ha prodotto un grafo di </w:t>
+      </w:r>
+      <w:r>
+        <w:rPr>
+          <w:i/>
+        </w:rPr>
+        <w:t>centodiciotto</w:t>
+      </w:r>
+      <w:r>
+        <w:t xml:space="preserve"> nodi e </w:t>
+      </w:r>
+      <w:r>
+        <w:rPr>
+          <w:i/>
+        </w:rPr>
+        <w:t>centotrentaquattro</w:t>
+      </w:r>
+      <w:r>
+        <w:t xml:space="preserve"> archi in tredici community. Il benchmark di token stimava una riduzione di 89.7 volte rispetto a passare il corpus intero come contesto.</w:t>
+      </w:r>
+    </w:p>
+    <w:p>
+      <w:pPr/>
+      <w:r>
+        <w:t xml:space="preserve">La classificazione contro la tassonomia ha dato </w:t>
+      </w:r>
+      <w:r>
+        <w:rPr>
+          <w:i/>
+        </w:rPr>
+        <w:t>trentuno</w:t>
+      </w:r>
+      <w:r>
+        <w:t xml:space="preserve"> fit iniziali, di cui </w:t>
+      </w:r>
+      <w:r>
+        <w:rPr>
+          <w:i/>
+        </w:rPr>
+        <w:t>quindici</w:t>
+      </w:r>
+      <w:r>
+        <w:t xml:space="preserve"> marcati </w:t>
+      </w:r>
+      <w:r>
+        <w:rPr>
+          <w:rFonts w:ascii="Consolas" w:hAnsi="Consolas"/>
+        </w:rPr>
+        <w:t>DA VERIFICARE</w:t>
+      </w:r>
+      <w:r>
+        <w:t xml:space="preserve"> per margine zero sul secondo classificato o per decisione presa su un solo token. Il gate </w:t>
+      </w:r>
+      <w:r>
+        <w:rPr>
+          <w:rFonts w:ascii="Consolas" w:hAnsi="Consolas"/>
+        </w:rPr>
+        <w:t>sanitize_taxonomy_diff.py</w:t>
+      </w:r>
+      <w:r>
+        <w:t xml:space="preserve"> ne ha scartati cinque per label troppo scarno dopo l'anonimizzazione, come </w:t>
+      </w:r>
+      <w:r>
+        <w:rPr>
+          <w:rFonts w:ascii="Consolas" w:hAnsi="Consolas"/>
+        </w:rPr>
+        <w:t>CRM module</w:t>
+      </w:r>
+      <w:r>
+        <w:t xml:space="preserve"> e </w:t>
+      </w:r>
+      <w:r>
+        <w:rPr>
+          <w:rFonts w:ascii="Consolas" w:hAnsi="Consolas"/>
+        </w:rPr>
+        <w:t>Team PM</w:t>
+      </w:r>
+      <w:r>
+        <w:t xml:space="preserve">, o per residuo di dominio di terzi come </w:t>
+      </w:r>
+      <w:r>
+        <w:rPr>
+          <w:rFonts w:ascii="Consolas" w:hAnsi="Consolas"/>
+        </w:rPr>
+        <w:t>SMTP Exchange (smtp.outlook.com)</w:t>
+      </w:r>
+      <w:r>
+        <w:t>.</w:t>
+      </w:r>
+    </w:p>
+    <w:p>
+      <w:pPr/>
+      <w:r>
+        <w:t xml:space="preserve">La revisione manuale del diff ha rifiutato altri undici fit chiaramente sbagliati e la sola </w:t>
+      </w:r>
+      <w:r>
+        <w:rPr>
+          <w:i/>
+        </w:rPr>
+        <w:t>nuova Capability</w:t>
+      </w:r>
+      <w:r>
+        <w:t xml:space="preserve"> suggerita. Il pattern degli errori era netto: la Capability </w:t>
+      </w:r>
+      <w:r>
+        <w:rPr>
+          <w:rFonts w:ascii="Consolas" w:hAnsi="Consolas"/>
+        </w:rPr>
+        <w:t>Time &amp; Attendance Management</w:t>
+      </w:r>
+      <w:r>
+        <w:t xml:space="preserve"> aveva attirato </w:t>
+      </w:r>
+      <w:r>
+        <w:rPr>
+          <w:i/>
+        </w:rPr>
+        <w:t>otto</w:t>
+      </w:r>
+      <w:r>
+        <w:t xml:space="preserve"> nodi che non c'entrano niente con l'omologa area di IT Operations, cioe' </w:t>
+      </w:r>
+      <w:r>
+        <w:rPr>
+          <w:rFonts w:ascii="Consolas" w:hAnsi="Consolas"/>
+        </w:rPr>
+        <w:t>Trados Studio 2026 Release</w:t>
+      </w:r>
+      <w:r>
+        <w:t xml:space="preserve">, </w:t>
+      </w:r>
+      <w:r>
+        <w:rPr>
+          <w:rFonts w:ascii="Consolas" w:hAnsi="Consolas"/>
+        </w:rPr>
+        <w:t>GroupShare 2020 SR1</w:t>
+      </w:r>
+      <w:r>
+        <w:t xml:space="preserve"> e </w:t>
+      </w:r>
+      <w:r>
+        <w:rPr>
+          <w:rFonts w:ascii="Consolas" w:hAnsi="Consolas"/>
+        </w:rPr>
+        <w:t>SR2+CU15</w:t>
+      </w:r>
+      <w:r>
+        <w:t xml:space="preserve">, </w:t>
+      </w:r>
+      <w:r>
+        <w:rPr>
+          <w:rFonts w:ascii="Consolas" w:hAnsi="Consolas"/>
+        </w:rPr>
+        <w:t>MultiTerm Server API REST v2</w:t>
+      </w:r>
+      <w:r>
+        <w:t xml:space="preserve">, </w:t>
+      </w:r>
+      <w:r>
+        <w:rPr>
+          <w:rFonts w:ascii="Consolas" w:hAnsi="Consolas"/>
+        </w:rPr>
+        <w:t>ESXi snapshot pre-upgrade</w:t>
+      </w:r>
+      <w:r>
+        <w:t xml:space="preserve">, </w:t>
+      </w:r>
+      <w:r>
+        <w:rPr>
+          <w:rFonts w:ascii="Consolas" w:hAnsi="Consolas"/>
+        </w:rPr>
+        <w:t>Backup SQL Server</w:t>
+      </w:r>
+      <w:r>
+        <w:t xml:space="preserve">, </w:t>
+      </w:r>
+      <w:r>
+        <w:rPr>
+          <w:rFonts w:ascii="Consolas" w:hAnsi="Consolas"/>
+        </w:rPr>
+        <w:t>RWS Support</w:t>
+      </w:r>
+      <w:r>
+        <w:t xml:space="preserve"> e </w:t>
+      </w:r>
+      <w:r>
+        <w:rPr>
+          <w:rFonts w:ascii="Consolas" w:hAnsi="Consolas"/>
+        </w:rPr>
+        <w:t>Pacchetti .sdlppx/.sdlrpx</w:t>
+      </w:r>
+      <w:r>
+        <w:t xml:space="preserve">. La radice e' che quella pagina ha nel proprio </w:t>
+      </w:r>
+      <w:r>
+        <w:rPr>
+          <w:rFonts w:ascii="Consolas" w:hAnsi="Consolas"/>
+        </w:rPr>
+        <w:t>## Technologies &amp; tools</w:t>
+      </w:r>
+      <w:r>
+        <w:t xml:space="preserve"> termini come </w:t>
+      </w:r>
+      <w:r>
+        <w:rPr>
+          <w:i/>
+        </w:rPr>
+        <w:t>schedule</w:t>
+      </w:r>
+      <w:r>
+        <w:t xml:space="preserve">, </w:t>
+      </w:r>
+      <w:r>
+        <w:rPr>
+          <w:i/>
+        </w:rPr>
+        <w:t>release</w:t>
+      </w:r>
+      <w:r>
+        <w:t xml:space="preserve">, </w:t>
+      </w:r>
+      <w:r>
+        <w:rPr>
+          <w:i/>
+        </w:rPr>
+        <w:t>snapshot</w:t>
+      </w:r>
+      <w:r>
+        <w:t xml:space="preserve"> e </w:t>
+      </w:r>
+      <w:r>
+        <w:rPr>
+          <w:i/>
+        </w:rPr>
+        <w:t>backup</w:t>
+      </w:r>
+      <w:r>
+        <w:t xml:space="preserve">, e la funzione di punteggio non pesa il segnale contro il contesto della Capability. Insieme sono stati riportati a </w:t>
+      </w:r>
+      <w:r>
+        <w:rPr>
+          <w:i/>
+        </w:rPr>
+        <w:t>unclassified</w:t>
+      </w:r>
+      <w:r>
+        <w:t xml:space="preserve"> anche </w:t>
+      </w:r>
+      <w:r>
+        <w:rPr>
+          <w:rFonts w:ascii="Consolas" w:hAnsi="Consolas"/>
+        </w:rPr>
+        <w:t>Task QM (quality management)</w:t>
+      </w:r>
+      <w:r>
+        <w:t xml:space="preserve"> mappato a </w:t>
+      </w:r>
+      <w:r>
+        <w:rPr>
+          <w:i/>
+        </w:rPr>
+        <w:t>Quality Certification</w:t>
+      </w:r>
+      <w:r>
+        <w:t xml:space="preserve"> per il solo token </w:t>
+      </w:r>
+      <w:r>
+        <w:rPr>
+          <w:i/>
+        </w:rPr>
+        <w:t>quality</w:t>
+      </w:r>
+      <w:r>
+        <w:t xml:space="preserve">, </w:t>
+      </w:r>
+      <w:r>
+        <w:rPr>
+          <w:rFonts w:ascii="Consolas" w:hAnsi="Consolas"/>
+        </w:rPr>
+        <w:t>Team Revisori EN</w:t>
+      </w:r>
+      <w:r>
+        <w:t xml:space="preserve"> mappato a </w:t>
+      </w:r>
+      <w:r>
+        <w:rPr>
+          <w:i/>
+        </w:rPr>
+        <w:t>Technical Knowledge Architecture</w:t>
+      </w:r>
+      <w:r>
+        <w:t xml:space="preserve"> per il solo token </w:t>
+      </w:r>
+      <w:r>
+        <w:rPr>
+          <w:i/>
+        </w:rPr>
+        <w:t>team</w:t>
+      </w:r>
+      <w:r>
+        <w:t xml:space="preserve">, e </w:t>
+      </w:r>
+      <w:r>
+        <w:rPr>
+          <w:rFonts w:ascii="Consolas" w:hAnsi="Consolas"/>
+        </w:rPr>
+        <w:t>Authentication Policy AllowBasicAuthIMAP-Odoo</w:t>
+      </w:r>
+      <w:r>
+        <w:t xml:space="preserve"> mappato a </w:t>
+      </w:r>
+      <w:r>
+        <w:rPr>
+          <w:i/>
+        </w:rPr>
+        <w:t>Backup &amp; Disaster Recovery</w:t>
+      </w:r>
+      <w:r>
+        <w:t xml:space="preserve"> per il solo token </w:t>
+      </w:r>
+      <w:r>
+        <w:rPr>
+          <w:i/>
+        </w:rPr>
+        <w:t>policy</w:t>
+      </w:r>
+      <w:r>
+        <w:t xml:space="preserve">. La </w:t>
+      </w:r>
+      <w:r>
+        <w:rPr>
+          <w:i/>
+        </w:rPr>
+        <w:t>nuova Capability</w:t>
+      </w:r>
+      <w:r>
+        <w:t xml:space="preserve"> proposta era </w:t>
+      </w:r>
+      <w:r>
+        <w:rPr>
+          <w:rFonts w:ascii="Consolas" w:hAnsi="Consolas"/>
+        </w:rPr>
+        <w:t>Bug Quantita 0 Su Righe SO (Blocca Ritorno A Preventivo)</w:t>
+      </w:r>
+      <w:r>
+        <w:t xml:space="preserve">, che e' un bug specifico non una Capability: rifiutata. Rimangono </w:t>
+      </w:r>
+      <w:r>
+        <w:rPr>
+          <w:i/>
+        </w:rPr>
+        <w:t>quindici</w:t>
+      </w:r>
+      <w:r>
+        <w:t xml:space="preserve"> fit su </w:t>
+      </w:r>
+      <w:r>
+        <w:rPr>
+          <w:i/>
+        </w:rPr>
+        <w:t>sette</w:t>
+      </w:r>
+      <w:r>
+        <w:t xml:space="preserve"> Capability, pubblicati sul repo pubblico con </w:t>
+      </w:r>
+      <w:r>
+        <w:rPr>
+          <w:rFonts w:ascii="Consolas" w:hAnsi="Consolas"/>
+        </w:rPr>
+        <w:t>export_to_taxonomy.py --apply</w:t>
+      </w:r>
+      <w:r>
+        <w:t>.</w:t>
+      </w:r>
+    </w:p>
+    <w:p>
+      <w:pPr/>
+      <w:r>
+        <w:t xml:space="preserve">Al verify di riservatezza dopo l'apply si sono presentati </w:t>
+      </w:r>
+      <w:r>
+        <w:rPr>
+          <w:i/>
+        </w:rPr>
+        <w:t>quattro</w:t>
+      </w:r>
+      <w:r>
+        <w:t xml:space="preserve"> riscontri della categoria </w:t>
+      </w:r>
+      <w:r>
+        <w:rPr>
+          <w:rFonts w:ascii="Consolas" w:hAnsi="Consolas"/>
+        </w:rPr>
+        <w:t>nome-persona</w:t>
+      </w:r>
+      <w:r>
+        <w:t xml:space="preserve"> sulla parola </w:t>
+      </w:r>
+      <w:r>
+        <w:rPr>
+          <w:i/>
+        </w:rPr>
+        <w:t>Procedura</w:t>
+      </w:r>
+      <w:r>
+        <w:t xml:space="preserve">, tutti falsi positivi. La causa era una voce nella mappa di anonimizzazione, </w:t>
+      </w:r>
+      <w:r>
+        <w:rPr>
+          <w:rFonts w:ascii="Consolas" w:hAnsi="Consolas"/>
+        </w:rPr>
+        <w:t>Procedura Reso = [PERSONA_52]</w:t>
+      </w:r>
+      <w:r>
+        <w:t xml:space="preserve">, prodotta dal riconoscitore italiano di </w:t>
+      </w:r>
+      <w:r>
+        <w:rPr>
+          <w:i/>
+        </w:rPr>
+        <w:t>NER</w:t>
+      </w:r>
+      <w:r>
+        <w:rPr>
+          <w:rStyle w:val="Rimandonotaapidipagina"/>
+        </w:rPr>
+        <w:footnoteReference w:id="27"/>
+      </w:r>
+      <w:r>
+        <w:t xml:space="preserve"> su un titolo di sezione della procedura di reso delle marche da bollo. La funzione </w:t>
+      </w:r>
+      <w:r>
+        <w:rPr>
+          <w:rFonts w:ascii="Consolas" w:hAnsi="Consolas"/>
+        </w:rPr>
+        <w:t>derive_person_terms</w:t>
+      </w:r>
+      <w:r>
+        <w:t xml:space="preserve"> di </w:t>
+      </w:r>
+      <w:r>
+        <w:rPr>
+          <w:rFonts w:ascii="Consolas" w:hAnsi="Consolas"/>
+        </w:rPr>
+        <w:t>verify_public_repo.py</w:t>
+      </w:r>
+      <w:r>
+        <w:t xml:space="preserve"> promuove al set dei nomi da cercare anche i singoli token di ogni voce a due parole con l'iniziale maiuscola, e cosi' </w:t>
+      </w:r>
+      <w:r>
+        <w:rPr>
+          <w:i/>
+        </w:rPr>
+        <w:t>Procedura</w:t>
+      </w:r>
+      <w:r>
+        <w:t xml:space="preserve"> e </w:t>
+      </w:r>
+      <w:r>
+        <w:rPr>
+          <w:i/>
+        </w:rPr>
+        <w:t>Reso</w:t>
+      </w:r>
+      <w:r>
+        <w:t xml:space="preserve"> sono finiti nella regex, generando quattro segnalazioni su file tecnici che parlano di procedure. Il fix e' stato aggiungere al set </w:t>
+      </w:r>
+      <w:r>
+        <w:rPr>
+          <w:rFonts w:ascii="Consolas" w:hAnsi="Consolas"/>
+        </w:rPr>
+        <w:t>NON_NAMES</w:t>
+      </w:r>
+      <w:r>
+        <w:t xml:space="preserve"> le parole italiane comuni che il </w:t>
+      </w:r>
+      <w:r>
+        <w:rPr>
+          <w:i/>
+        </w:rPr>
+        <w:t>NER</w:t>
+      </w:r>
+      <w:r>
+        <w:t xml:space="preserve"> estrae erroneamente come nomi propri quando le trova appaiate in una coppia </w:t>
+      </w:r>
+      <w:r>
+        <w:rPr>
+          <w:rFonts w:ascii="Consolas" w:hAnsi="Consolas"/>
+        </w:rPr>
+        <w:t>Nome Cognome</w:t>
+      </w:r>
+      <w:r>
+        <w:t xml:space="preserve">: </w:t>
+      </w:r>
+      <w:r>
+        <w:rPr>
+          <w:rFonts w:ascii="Consolas" w:hAnsi="Consolas"/>
+        </w:rPr>
+        <w:t>procedura</w:t>
+      </w:r>
+      <w:r>
+        <w:t xml:space="preserve">, </w:t>
+      </w:r>
+      <w:r>
+        <w:rPr>
+          <w:rFonts w:ascii="Consolas" w:hAnsi="Consolas"/>
+        </w:rPr>
+        <w:t>reso</w:t>
+      </w:r>
+      <w:r>
+        <w:t xml:space="preserve">, </w:t>
+      </w:r>
+      <w:r>
+        <w:rPr>
+          <w:rFonts w:ascii="Consolas" w:hAnsi="Consolas"/>
+        </w:rPr>
+        <w:t>storno</w:t>
+      </w:r>
+      <w:r>
+        <w:t xml:space="preserve">, </w:t>
+      </w:r>
+      <w:r>
+        <w:rPr>
+          <w:rFonts w:ascii="Consolas" w:hAnsi="Consolas"/>
+        </w:rPr>
+        <w:t>cambio</w:t>
+      </w:r>
+      <w:r>
+        <w:t xml:space="preserve">, </w:t>
+      </w:r>
+      <w:r>
+        <w:rPr>
+          <w:rFonts w:ascii="Consolas" w:hAnsi="Consolas"/>
+        </w:rPr>
+        <w:t>anno</w:t>
+      </w:r>
+      <w:r>
+        <w:t xml:space="preserve">, </w:t>
+      </w:r>
+      <w:r>
+        <w:rPr>
+          <w:rFonts w:ascii="Consolas" w:hAnsi="Consolas"/>
+        </w:rPr>
+        <w:t>ordine</w:t>
+      </w:r>
+      <w:r>
+        <w:t xml:space="preserve">, </w:t>
+      </w:r>
+      <w:r>
+        <w:rPr>
+          <w:rFonts w:ascii="Consolas" w:hAnsi="Consolas"/>
+        </w:rPr>
+        <w:t>fattura</w:t>
+      </w:r>
+      <w:r>
+        <w:t xml:space="preserve">, </w:t>
+      </w:r>
+      <w:r>
+        <w:rPr>
+          <w:rFonts w:ascii="Consolas" w:hAnsi="Consolas"/>
+        </w:rPr>
+        <w:t>fatture</w:t>
+      </w:r>
+      <w:r>
+        <w:t xml:space="preserve">, </w:t>
+      </w:r>
+      <w:r>
+        <w:rPr>
+          <w:rFonts w:ascii="Consolas" w:hAnsi="Consolas"/>
+        </w:rPr>
+        <w:t>sequenze</w:t>
+      </w:r>
+      <w:r>
+        <w:t xml:space="preserve">, </w:t>
+      </w:r>
+      <w:r>
+        <w:rPr>
+          <w:rFonts w:ascii="Consolas" w:hAnsi="Consolas"/>
+        </w:rPr>
+        <w:t>sequenza</w:t>
+      </w:r>
+      <w:r>
+        <w:t xml:space="preserve">, </w:t>
+      </w:r>
+      <w:r>
+        <w:rPr>
+          <w:rFonts w:ascii="Consolas" w:hAnsi="Consolas"/>
+        </w:rPr>
+        <w:t>tabella</w:t>
+      </w:r>
+      <w:r>
+        <w:t xml:space="preserve">, </w:t>
+      </w:r>
+      <w:r>
+        <w:rPr>
+          <w:rFonts w:ascii="Consolas" w:hAnsi="Consolas"/>
+        </w:rPr>
+        <w:t>pagina</w:t>
+      </w:r>
+      <w:r>
+        <w:t xml:space="preserve">, </w:t>
+      </w:r>
+      <w:r>
+        <w:rPr>
+          <w:rFonts w:ascii="Consolas" w:hAnsi="Consolas"/>
+        </w:rPr>
+        <w:t>codice</w:t>
+      </w:r>
+      <w:r>
+        <w:t xml:space="preserve">, </w:t>
+      </w:r>
+      <w:r>
+        <w:rPr>
+          <w:rFonts w:ascii="Consolas" w:hAnsi="Consolas"/>
+        </w:rPr>
+        <w:t>codici</w:t>
+      </w:r>
+      <w:r>
+        <w:t xml:space="preserve">, </w:t>
+      </w:r>
+      <w:r>
+        <w:rPr>
+          <w:rFonts w:ascii="Consolas" w:hAnsi="Consolas"/>
+        </w:rPr>
+        <w:t>magazzino</w:t>
+      </w:r>
+      <w:r>
+        <w:t xml:space="preserve">, </w:t>
+      </w:r>
+      <w:r>
+        <w:rPr>
+          <w:rFonts w:ascii="Consolas" w:hAnsi="Consolas"/>
+        </w:rPr>
+        <w:t>progetto</w:t>
+      </w:r>
+      <w:r>
+        <w:t xml:space="preserve">, </w:t>
+      </w:r>
+      <w:r>
+        <w:rPr>
+          <w:rFonts w:ascii="Consolas" w:hAnsi="Consolas"/>
+        </w:rPr>
+        <w:t>progetti</w:t>
+      </w:r>
+      <w:r>
+        <w:t xml:space="preserve">, </w:t>
+      </w:r>
+      <w:r>
+        <w:rPr>
+          <w:rFonts w:ascii="Consolas" w:hAnsi="Consolas"/>
+        </w:rPr>
+        <w:t>marca</w:t>
+      </w:r>
+      <w:r>
+        <w:t xml:space="preserve">, </w:t>
+      </w:r>
+      <w:r>
+        <w:rPr>
+          <w:rFonts w:ascii="Consolas" w:hAnsi="Consolas"/>
+        </w:rPr>
+        <w:t>marche</w:t>
+      </w:r>
+      <w:r>
+        <w:t xml:space="preserve">, </w:t>
+      </w:r>
+      <w:r>
+        <w:rPr>
+          <w:rFonts w:ascii="Consolas" w:hAnsi="Consolas"/>
+        </w:rPr>
+        <w:t>bollo</w:t>
+      </w:r>
+      <w:r>
+        <w:t xml:space="preserve">, </w:t>
+      </w:r>
+      <w:r>
+        <w:rPr>
+          <w:rFonts w:ascii="Consolas" w:hAnsi="Consolas"/>
+        </w:rPr>
+        <w:t>bolli</w:t>
+      </w:r>
+      <w:r>
+        <w:t xml:space="preserve">, </w:t>
+      </w:r>
+      <w:r>
+        <w:rPr>
+          <w:rFonts w:ascii="Consolas" w:hAnsi="Consolas"/>
+        </w:rPr>
+        <w:t>lavori</w:t>
+      </w:r>
+      <w:r>
+        <w:t xml:space="preserve">, </w:t>
+      </w:r>
+      <w:r>
+        <w:rPr>
+          <w:rFonts w:ascii="Consolas" w:hAnsi="Consolas"/>
+        </w:rPr>
+        <w:t>vendite</w:t>
+      </w:r>
+      <w:r>
+        <w:t xml:space="preserve">, </w:t>
+      </w:r>
+      <w:r>
+        <w:rPr>
+          <w:rFonts w:ascii="Consolas" w:hAnsi="Consolas"/>
+        </w:rPr>
+        <w:t>acquisti</w:t>
+      </w:r>
+      <w:r>
+        <w:t xml:space="preserve">, </w:t>
+      </w:r>
+      <w:r>
+        <w:rPr>
+          <w:rFonts w:ascii="Consolas" w:hAnsi="Consolas"/>
+        </w:rPr>
+        <w:t>revisione</w:t>
+      </w:r>
+      <w:r>
+        <w:t xml:space="preserve">, </w:t>
+      </w:r>
+      <w:r>
+        <w:rPr>
+          <w:rFonts w:ascii="Consolas" w:hAnsi="Consolas"/>
+        </w:rPr>
+        <w:t>traduzione</w:t>
+      </w:r>
+      <w:r>
+        <w:t xml:space="preserve">, </w:t>
+      </w:r>
+      <w:r>
+        <w:rPr>
+          <w:rFonts w:ascii="Consolas" w:hAnsi="Consolas"/>
+        </w:rPr>
+        <w:t>preventivo</w:t>
+      </w:r>
+      <w:r>
+        <w:t xml:space="preserve">, </w:t>
+      </w:r>
+      <w:r>
+        <w:rPr>
+          <w:rFonts w:ascii="Consolas" w:hAnsi="Consolas"/>
+        </w:rPr>
+        <w:t>preventivi</w:t>
+      </w:r>
+      <w:r>
+        <w:t xml:space="preserve">, </w:t>
+      </w:r>
+      <w:r>
+        <w:rPr>
+          <w:rFonts w:ascii="Consolas" w:hAnsi="Consolas"/>
+        </w:rPr>
+        <w:t>trasferimento</w:t>
+      </w:r>
+      <w:r>
+        <w:t xml:space="preserve">, </w:t>
+      </w:r>
+      <w:r>
+        <w:rPr>
+          <w:rFonts w:ascii="Consolas" w:hAnsi="Consolas"/>
+        </w:rPr>
+        <w:t>impostazioni</w:t>
+      </w:r>
+      <w:r>
+        <w:t>. Il verify e' tornato pulito dopo la fix.</w:t>
+      </w:r>
+    </w:p>
+    <w:p>
+      <w:pPr/>
+      <w:r>
+        <w:t xml:space="preserve">Restano sul tavolo due valutazioni. La prima e' se stringere le keyword della Capability </w:t>
+      </w:r>
+      <w:r>
+        <w:rPr>
+          <w:rFonts w:ascii="Consolas" w:hAnsi="Consolas"/>
+        </w:rPr>
+        <w:t>Time &amp; Attendance Management</w:t>
+      </w:r>
+      <w:r>
+        <w:t xml:space="preserve">, che nel ciclo ha rivendicato otto nodi fuori tema per parole innocue del suo </w:t>
+      </w:r>
+      <w:r>
+        <w:rPr>
+          <w:rFonts w:ascii="Consolas" w:hAnsi="Consolas"/>
+        </w:rPr>
+        <w:t>## Technologies &amp; tools</w:t>
+      </w:r>
+      <w:r>
+        <w:t xml:space="preserve">; la scelta minima e' guardare quelle keyword una a una e togliere le tre che hanno prodotto la fuga. La seconda e' che </w:t>
+      </w:r>
+      <w:r>
+        <w:rPr>
+          <w:i/>
+        </w:rPr>
+        <w:t>sei</w:t>
+      </w:r>
+      <w:r>
+        <w:t xml:space="preserve"> nuovi domini sono usciti dal </w:t>
+      </w:r>
+      <w:r>
+        <w:rPr>
+          <w:rFonts w:ascii="Consolas" w:hAnsi="Consolas"/>
+        </w:rPr>
+        <w:t>map_to_taxonomy.py</w:t>
+      </w:r>
+      <w:r>
+        <w:t xml:space="preserve"> come proposte a media coerenza, tra cui </w:t>
+      </w:r>
+      <w:r>
+        <w:rPr>
+          <w:rFonts w:ascii="Consolas" w:hAnsi="Consolas"/>
+        </w:rPr>
+        <w:t>Autoassegnazione Task Revisione/Traduzione</w:t>
+      </w:r>
+      <w:r>
+        <w:t xml:space="preserve"> con tre nodi e </w:t>
+      </w:r>
+      <w:r>
+        <w:rPr>
+          <w:rFonts w:ascii="Consolas" w:hAnsi="Consolas"/>
+        </w:rPr>
+        <w:t>Pulizia Sessione Browser (Cookies/Cache/Devtools)</w:t>
+      </w:r>
+      <w:r>
+        <w:t xml:space="preserve"> con sette nodi. Nessuno e' un dominio della tassonomia esistente, quindi vanno valutati manualmente se aprire una pagina nuova o se assorbire i nodi in Capability esistenti; ma non sono un debito, sono un'osservazione da riprendere quando si affronta un ciclo che tocchi la stessa area.</w:t>
+      </w:r>
+    </w:p>
+    <w:p>
+      <w:pPr/>
+      <w:r>
+        <w:t xml:space="preserve">Numeri finali del ciclo: </w:t>
+      </w:r>
+      <w:r>
+        <w:rPr>
+          <w:i/>
+        </w:rPr>
+        <w:t>ventiquattro</w:t>
+      </w:r>
+      <w:r>
+        <w:t xml:space="preserve"> documenti in ingresso, </w:t>
+      </w:r>
+      <w:r>
+        <w:rPr>
+          <w:i/>
+        </w:rPr>
+        <w:t>quindici</w:t>
+      </w:r>
+      <w:r>
+        <w:t xml:space="preserve"> evidenze pubblicate su </w:t>
+      </w:r>
+      <w:r>
+        <w:rPr>
+          <w:i/>
+        </w:rPr>
+        <w:t>sette</w:t>
+      </w:r>
+      <w:r>
+        <w:t xml:space="preserve"> Capability, zero errori di sanitizzazione al verify dopo la fix del set dei falsi nomi. Nessuna nuova Capability creata sul repo pubblico.</w:t>
       </w:r>
     </w:p>
     <w:p>
@@ -18711,6 +19775,79 @@
           <w:szCs w:val="18"/>
         </w:rPr>
         <w:t xml:space="preserve">, Secure Hash Algorithm - la funzione di hash con cui git identifica ogni oggetto del repository; l'identificativo di un commit e' il suo digest, e un oggetto resta recuperabile per digest anche quando nessun ramo lo raggiunge piu'.</w:t>
+      </w:r>
+    </w:p>
+  </w:footnote>
+  <w:footnote w:id="27">
+    <w:p>
+      <w:pPr>
+        <w:spacing w:after="40"/>
+        <w:jc w:val="both"/>
+      </w:pPr>
+      <w:r>
+        <w:rPr>
+          <w:rStyle w:val="Rimandonotaapidipagina"/>
+        </w:rPr>
+        <w:footnoteRef/>
+      </w:r>
+      <w:r>
+        <w:rPr>
+          <w:color w:val="595959"/>
+          <w:sz w:val="18"/>
+          <w:szCs w:val="18"/>
+        </w:rPr>
+        <w:t xml:space="preserve"> </w:t>
+      </w:r>
+      <w:r>
+        <w:rPr>
+          <w:i/>
+          <w:color w:val="595959"/>
+          <w:sz w:val="18"/>
+          <w:szCs w:val="18"/>
+        </w:rPr>
+        <w:t xml:space="preserve">NER</w:t>
+      </w:r>
+      <w:r>
+        <w:rPr>
+          <w:color w:val="595959"/>
+          <w:sz w:val="18"/>
+          <w:szCs w:val="18"/>
+        </w:rPr>
+        <w:t xml:space="preserve">, Named Entity Recognition - riconoscitore di entita' testuali (persone, organizzazioni, luoghi) usato in </w:t>
+      </w:r>
+      <w:r>
+        <w:rPr>
+          <w:rFonts w:ascii="Consolas" w:hAnsi="Consolas"/>
+          <w:color w:val="595959"/>
+          <w:sz w:val="18"/>
+          <w:szCs w:val="18"/>
+        </w:rPr>
+        <w:t xml:space="preserve">enrich_graph.py</w:t>
+      </w:r>
+      <w:r>
+        <w:rPr>
+          <w:color w:val="595959"/>
+          <w:sz w:val="18"/>
+          <w:szCs w:val="18"/>
+        </w:rPr>
+        <w:t xml:space="preserve">; il modello italiano usato tende a scambiare per nome proprio qualsiasi coppia </w:t>
+      </w:r>
+      <w:r>
+        <w:rPr>
+          <w:rFonts w:ascii="Consolas" w:hAnsi="Consolas"/>
+          <w:color w:val="595959"/>
+          <w:sz w:val="18"/>
+          <w:szCs w:val="18"/>
+        </w:rPr>
+        <w:t xml:space="preserve">parola parola</w:t>
+      </w:r>
+      <w:r>
+        <w:rPr>
+          <w:color w:val="595959"/>
+          <w:sz w:val="18"/>
+          <w:szCs w:val="18"/>
+        </w:rPr>
+        <w:t xml:space="preserve"> a iniziali maiuscole, anche quando entrambi i termini sono sostantivi comuni.</w:t>
       </w:r>
     </w:p>
   </w:footnote>

</xml_diff>